<commit_message>
Estado del arte acabado pero sin corregir
</commit_message>
<xml_diff>
--- a/tfgs/tfgs/correcciones.docx
+++ b/tfgs/tfgs/correcciones.docx
@@ -29,7 +29,23 @@
     </w:p>
     <w:p>
       <w:r>
-        <w:t>principalmente con Oculus Rift, HTC Vive y posteriormente con Quest, uno de</w:t>
+        <w:t xml:space="preserve">principalmente con </w:t>
+      </w:r>
+      <w:proofErr w:type="spellStart"/>
+      <w:r>
+        <w:t>Oculus</w:t>
+      </w:r>
+      <w:proofErr w:type="spellEnd"/>
+      <w:r>
+        <w:t xml:space="preserve"> Rift, HTC Vive y posteriormente con </w:t>
+      </w:r>
+      <w:proofErr w:type="spellStart"/>
+      <w:r>
+        <w:t>Quest</w:t>
+      </w:r>
+      <w:proofErr w:type="spellEnd"/>
+      <w:r>
+        <w:t>, uno de</w:t>
       </w:r>
     </w:p>
     <w:p>
@@ -568,7 +584,51 @@
           <w:lang w:eastAsia="en-US" w:bidi="ar-SA"/>
           <w14:ligatures w14:val="standardContextual"/>
         </w:rPr>
-        <w:t>como Oculus Quest que aspiran a minimizar el uso de cables y complementos</w:t>
+        <w:t xml:space="preserve">como </w:t>
+      </w:r>
+      <w:proofErr w:type="spellStart"/>
+      <w:r>
+        <w:rPr>
+          <w:rFonts w:ascii="F38" w:hAnsi="F38" w:cs="F38"/>
+          <w:color w:val="000000"/>
+          <w:kern w:val="0"/>
+          <w:lang w:eastAsia="en-US" w:bidi="ar-SA"/>
+          <w14:ligatures w14:val="standardContextual"/>
+        </w:rPr>
+        <w:t>Oculus</w:t>
+      </w:r>
+      <w:proofErr w:type="spellEnd"/>
+      <w:r>
+        <w:rPr>
+          <w:rFonts w:ascii="F38" w:hAnsi="F38" w:cs="F38"/>
+          <w:color w:val="000000"/>
+          <w:kern w:val="0"/>
+          <w:lang w:eastAsia="en-US" w:bidi="ar-SA"/>
+          <w14:ligatures w14:val="standardContextual"/>
+        </w:rPr>
+        <w:t xml:space="preserve"> </w:t>
+      </w:r>
+      <w:proofErr w:type="spellStart"/>
+      <w:r>
+        <w:rPr>
+          <w:rFonts w:ascii="F38" w:hAnsi="F38" w:cs="F38"/>
+          <w:color w:val="000000"/>
+          <w:kern w:val="0"/>
+          <w:lang w:eastAsia="en-US" w:bidi="ar-SA"/>
+          <w14:ligatures w14:val="standardContextual"/>
+        </w:rPr>
+        <w:t>Quest</w:t>
+      </w:r>
+      <w:proofErr w:type="spellEnd"/>
+      <w:r>
+        <w:rPr>
+          <w:rFonts w:ascii="F38" w:hAnsi="F38" w:cs="F38"/>
+          <w:color w:val="000000"/>
+          <w:kern w:val="0"/>
+          <w:lang w:eastAsia="en-US" w:bidi="ar-SA"/>
+          <w14:ligatures w14:val="standardContextual"/>
+        </w:rPr>
+        <w:t xml:space="preserve"> que aspiran a minimizar el uso de cables y complementos</w:t>
       </w:r>
       <w:r>
         <w:rPr>
@@ -1094,7 +1154,73 @@
           <w:lang w:eastAsia="en-US" w:bidi="ar-SA"/>
           <w14:ligatures w14:val="standardContextual"/>
         </w:rPr>
-        <w:t>sociales de Realidad Virtual (como VRChat y Horizon Worlds).</w:t>
+        <w:t xml:space="preserve">sociales de Realidad Virtual (como </w:t>
+      </w:r>
+      <w:proofErr w:type="spellStart"/>
+      <w:r>
+        <w:rPr>
+          <w:rFonts w:ascii="F63" w:hAnsi="F63" w:cs="F63"/>
+          <w:color w:val="000000"/>
+          <w:kern w:val="0"/>
+          <w:lang w:eastAsia="en-US" w:bidi="ar-SA"/>
+          <w14:ligatures w14:val="standardContextual"/>
+        </w:rPr>
+        <w:t>VRChat</w:t>
+      </w:r>
+      <w:proofErr w:type="spellEnd"/>
+      <w:r>
+        <w:rPr>
+          <w:rFonts w:ascii="F63" w:hAnsi="F63" w:cs="F63"/>
+          <w:color w:val="000000"/>
+          <w:kern w:val="0"/>
+          <w:lang w:eastAsia="en-US" w:bidi="ar-SA"/>
+          <w14:ligatures w14:val="standardContextual"/>
+        </w:rPr>
+        <w:t xml:space="preserve"> y </w:t>
+      </w:r>
+      <w:proofErr w:type="spellStart"/>
+      <w:r>
+        <w:rPr>
+          <w:rFonts w:ascii="F63" w:hAnsi="F63" w:cs="F63"/>
+          <w:color w:val="000000"/>
+          <w:kern w:val="0"/>
+          <w:lang w:eastAsia="en-US" w:bidi="ar-SA"/>
+          <w14:ligatures w14:val="standardContextual"/>
+        </w:rPr>
+        <w:t>Horizon</w:t>
+      </w:r>
+      <w:proofErr w:type="spellEnd"/>
+      <w:r>
+        <w:rPr>
+          <w:rFonts w:ascii="F63" w:hAnsi="F63" w:cs="F63"/>
+          <w:color w:val="000000"/>
+          <w:kern w:val="0"/>
+          <w:lang w:eastAsia="en-US" w:bidi="ar-SA"/>
+          <w14:ligatures w14:val="standardContextual"/>
+        </w:rPr>
+        <w:t xml:space="preserve"> </w:t>
+      </w:r>
+      <w:proofErr w:type="spellStart"/>
+      <w:r>
+        <w:rPr>
+          <w:rFonts w:ascii="F63" w:hAnsi="F63" w:cs="F63"/>
+          <w:color w:val="000000"/>
+          <w:kern w:val="0"/>
+          <w:lang w:eastAsia="en-US" w:bidi="ar-SA"/>
+          <w14:ligatures w14:val="standardContextual"/>
+        </w:rPr>
+        <w:t>Worlds</w:t>
+      </w:r>
+      <w:proofErr w:type="spellEnd"/>
+      <w:r>
+        <w:rPr>
+          <w:rFonts w:ascii="F63" w:hAnsi="F63" w:cs="F63"/>
+          <w:color w:val="000000"/>
+          <w:kern w:val="0"/>
+          <w:lang w:eastAsia="en-US" w:bidi="ar-SA"/>
+          <w14:ligatures w14:val="standardContextual"/>
+        </w:rPr>
+        <w:t>).</w:t>
       </w:r>
     </w:p>
     <w:p>
@@ -1289,7 +1415,29 @@
           <w:lang w:eastAsia="en-US" w:bidi="ar-SA"/>
           <w14:ligatures w14:val="standardContextual"/>
         </w:rPr>
-        <w:t>[1] y Peng y colaboradores (2024) [2], se ha corroborado lo siguiente:</w:t>
+        <w:t xml:space="preserve">[1] y </w:t>
+      </w:r>
+      <w:proofErr w:type="spellStart"/>
+      <w:r>
+        <w:rPr>
+          <w:rFonts w:ascii="F63" w:hAnsi="F63" w:cs="F63"/>
+          <w:color w:val="000000"/>
+          <w:kern w:val="0"/>
+          <w:lang w:eastAsia="en-US" w:bidi="ar-SA"/>
+          <w14:ligatures w14:val="standardContextual"/>
+        </w:rPr>
+        <w:t>Peng</w:t>
+      </w:r>
+      <w:proofErr w:type="spellEnd"/>
+      <w:r>
+        <w:rPr>
+          <w:rFonts w:ascii="F63" w:hAnsi="F63" w:cs="F63"/>
+          <w:color w:val="000000"/>
+          <w:kern w:val="0"/>
+          <w:lang w:eastAsia="en-US" w:bidi="ar-SA"/>
+          <w14:ligatures w14:val="standardContextual"/>
+        </w:rPr>
+        <w:t xml:space="preserve"> y colaboradores (2024) [2], se ha corroborado lo siguiente:</w:t>
       </w:r>
     </w:p>
     <w:p>
@@ -2130,7 +2278,21 @@
         <w:rPr>
           <w:lang w:eastAsia="es-ES" w:bidi="ar-SA"/>
         </w:rPr>
-        <w:t xml:space="preserve">La capacidad para cambiar teclados físicos y virtuales en la Realidad Virtual, tal y como se estudia en ReconViguRation, abre nuevas oportunidades para la personalización y el respaldo en diversas lenguas. Sin embargo, la puesta en marcha de estas soluciones aún es reciente y requiere más estudio y evolución para alcanzar el nivel de madurez que se percibe en otras áreas </w:t>
+        <w:t xml:space="preserve">La capacidad para cambiar teclados físicos y virtuales en la Realidad Virtual, tal y como se estudia en </w:t>
+      </w:r>
+      <w:proofErr w:type="spellStart"/>
+      <w:r>
+        <w:rPr>
+          <w:lang w:eastAsia="es-ES" w:bidi="ar-SA"/>
+        </w:rPr>
+        <w:t>ReconViguRation</w:t>
+      </w:r>
+      <w:proofErr w:type="spellEnd"/>
+      <w:r>
+        <w:rPr>
+          <w:lang w:eastAsia="es-ES" w:bidi="ar-SA"/>
+        </w:rPr>
+        <w:t xml:space="preserve">, abre nuevas oportunidades para la personalización y el respaldo en diversas lenguas. Sin embargo, la puesta en marcha de estas soluciones aún es reciente y requiere más estudio y evolución para alcanzar el nivel de madurez que se percibe en otras áreas </w:t>
       </w:r>
       <w:r>
         <w:rPr>
@@ -2212,7 +2374,21 @@
         <w:rPr>
           <w:lang w:eastAsia="es-ES" w:bidi="ar-SA"/>
         </w:rPr>
-        <w:t xml:space="preserve">La creación de ambientes de Realidad Virtual multilingües no solo promueve la inclusión y la equidad, sino que también facilita la formación de comunidades mundiales de aprendizaje, cooperación y diversión. Compañías y programadores que opten por la accesibilidad lingüística tendrán la posibilidad de ingresar a mercados en desarrollo y variados, potenciando así su competitividad y importancia en un mundo cada vez más interrelacionado. Adicionalmente, la oportunidad de comunicarse en el idioma nativo fomenta la participación activa y el sentimiento de pertenencia de los usuarios, elementos esenciales para el triunfo y la perdurabilidad de las plataformas de Realidad Virtual. </w:t>
+        <w:t xml:space="preserve">La creación de ambientes de Realidad Virtual multilingües no solo promueve la inclusión y la equidad, sino que también facilita la formación de comunidades mundiales de aprendizaje, cooperación y diversión. Compañías y programadores que opten por la accesibilidad lingüística tendrán la posibilidad de ingresar a mercados en desarrollo y variados, potenciando así su competitividad </w:t>
+      </w:r>
+      <w:proofErr w:type="spellStart"/>
+      <w:r>
+        <w:rPr>
+          <w:lang w:eastAsia="es-ES" w:bidi="ar-SA"/>
+        </w:rPr>
+        <w:t>y</w:t>
+      </w:r>
+      <w:proofErr w:type="spellEnd"/>
+      <w:r>
+        <w:rPr>
+          <w:lang w:eastAsia="es-ES" w:bidi="ar-SA"/>
+        </w:rPr>
+        <w:t xml:space="preserve"> importancia en un mundo cada vez más interrelacionado. Adicionalmente, la oportunidad de comunicarse en el idioma nativo fomenta la participación activa y el sentimiento de pertenencia de los usuarios, elementos esenciales para el triunfo y la perdurabilidad de las plataformas de Realidad Virtual. </w:t>
       </w:r>
       <w:r>
         <w:rPr>
@@ -2245,8 +2421,13 @@
         <w:t>fi</w:t>
       </w:r>
       <w:r>
-        <w:t>nición y contexto de las NUIs</w:t>
-      </w:r>
+        <w:t xml:space="preserve">nición y contexto de las </w:t>
+      </w:r>
+      <w:proofErr w:type="spellStart"/>
+      <w:r>
+        <w:t>NUIs</w:t>
+      </w:r>
+      <w:proofErr w:type="spellEnd"/>
     </w:p>
     <w:p>
       <w:pPr>
@@ -2390,19 +2571,7 @@
         <w:rPr>
           <w:lang w:eastAsia="es-ES" w:bidi="ar-SA"/>
         </w:rPr>
-        <w:t xml:space="preserve">imitar las interacciones </w:t>
-      </w:r>
-      <w:r>
-        <w:rPr>
-          <w:lang w:eastAsia="es-ES" w:bidi="ar-SA"/>
-        </w:rPr>
-        <w:t>sensoriomotoras</w:t>
-      </w:r>
-      <w:r>
-        <w:rPr>
-          <w:lang w:eastAsia="es-ES" w:bidi="ar-SA"/>
-        </w:rPr>
-        <w:t xml:space="preserve"> humanas,</w:t>
+        <w:t>imitar las interacciones sensoriomotoras humanas,</w:t>
       </w:r>
       <w:r>
         <w:rPr>
@@ -2470,7 +2639,21 @@
         <w:rPr>
           <w:lang w:eastAsia="es-ES" w:bidi="ar-SA"/>
         </w:rPr>
-        <w:t>Ejemplos de NUIs incluyen asistentes de voz como Alexa o Siri, sistemas de control por</w:t>
+        <w:t xml:space="preserve">Ejemplos de </w:t>
+      </w:r>
+      <w:proofErr w:type="spellStart"/>
+      <w:r>
+        <w:rPr>
+          <w:lang w:eastAsia="es-ES" w:bidi="ar-SA"/>
+        </w:rPr>
+        <w:t>NUIs</w:t>
+      </w:r>
+      <w:proofErr w:type="spellEnd"/>
+      <w:r>
+        <w:rPr>
+          <w:lang w:eastAsia="es-ES" w:bidi="ar-SA"/>
+        </w:rPr>
+        <w:t xml:space="preserve"> incluyen asistentes de voz como Alexa o Siri, sistemas de control por</w:t>
       </w:r>
       <w:r>
         <w:rPr>
@@ -2574,8 +2757,30 @@
         <w:rPr>
           <w:lang w:eastAsia="es-ES" w:bidi="ar-SA"/>
         </w:rPr>
-        <w:t>con el enfoque de las NUIs, que ya he explicado. No obstante, a pesar de que las NUIs</w:t>
-      </w:r>
+        <w:t xml:space="preserve">con el enfoque de las </w:t>
+      </w:r>
+      <w:proofErr w:type="spellStart"/>
+      <w:r>
+        <w:rPr>
+          <w:lang w:eastAsia="es-ES" w:bidi="ar-SA"/>
+        </w:rPr>
+        <w:t>NUIs</w:t>
+      </w:r>
+      <w:proofErr w:type="spellEnd"/>
+      <w:r>
+        <w:rPr>
+          <w:lang w:eastAsia="es-ES" w:bidi="ar-SA"/>
+        </w:rPr>
+        <w:t xml:space="preserve">, que ya he explicado. No obstante, a pesar de que las </w:t>
+      </w:r>
+      <w:proofErr w:type="spellStart"/>
+      <w:r>
+        <w:rPr>
+          <w:lang w:eastAsia="es-ES" w:bidi="ar-SA"/>
+        </w:rPr>
+        <w:t>NUIs</w:t>
+      </w:r>
+      <w:proofErr w:type="spellEnd"/>
       <w:r>
         <w:rPr>
           <w:lang w:eastAsia="es-ES" w:bidi="ar-SA"/>
@@ -2661,7 +2866,15 @@
         <w:pStyle w:val="Ttulo2"/>
       </w:pPr>
       <w:r>
-        <w:t>2.5.2. Tecnologías principales en las NUIs para VR</w:t>
+        <w:t xml:space="preserve">2.5.2. Tecnologías principales en las </w:t>
+      </w:r>
+      <w:proofErr w:type="spellStart"/>
+      <w:r>
+        <w:t>NUIs</w:t>
+      </w:r>
+      <w:proofErr w:type="spellEnd"/>
+      <w:r>
+        <w:t xml:space="preserve"> para VR</w:t>
       </w:r>
     </w:p>
     <w:p>
@@ -2682,20 +2895,16 @@
         <w:rPr>
           <w:lang w:eastAsia="es-ES" w:bidi="ar-SA"/>
         </w:rPr>
-        <w:t xml:space="preserve">Esta es una de las tecnologías, por no decir la </w:t>
-      </w:r>
-      <w:r>
-        <w:rPr>
-          <w:lang w:eastAsia="es-ES" w:bidi="ar-SA"/>
-        </w:rPr>
-        <w:t>tecnología</w:t>
-      </w:r>
-      <w:r>
-        <w:rPr>
-          <w:lang w:eastAsia="es-ES" w:bidi="ar-SA"/>
-        </w:rPr>
-        <w:t>, más destacada en las NUIs</w:t>
-      </w:r>
+        <w:t xml:space="preserve">Esta es una de las tecnologías, por no decir la tecnología, más destacada en las </w:t>
+      </w:r>
+      <w:proofErr w:type="spellStart"/>
+      <w:r>
+        <w:rPr>
+          <w:lang w:eastAsia="es-ES" w:bidi="ar-SA"/>
+        </w:rPr>
+        <w:t>NUIs</w:t>
+      </w:r>
+      <w:proofErr w:type="spellEnd"/>
       <w:r>
         <w:rPr>
           <w:lang w:eastAsia="es-ES" w:bidi="ar-SA"/>
@@ -2802,7 +3011,21 @@
         <w:rPr>
           <w:lang w:eastAsia="es-ES" w:bidi="ar-SA"/>
         </w:rPr>
-        <w:t>otro lado, hay técnicas, como Zoom-fwd, que demuestran que el reconocimiento de gestos</w:t>
+        <w:t>otro lado, hay técnicas, como Zoom-</w:t>
+      </w:r>
+      <w:proofErr w:type="spellStart"/>
+      <w:r>
+        <w:rPr>
+          <w:lang w:eastAsia="es-ES" w:bidi="ar-SA"/>
+        </w:rPr>
+        <w:t>fwd</w:t>
+      </w:r>
+      <w:proofErr w:type="spellEnd"/>
+      <w:r>
+        <w:rPr>
+          <w:lang w:eastAsia="es-ES" w:bidi="ar-SA"/>
+        </w:rPr>
+        <w:t>, que demuestran que el reconocimiento de gestos</w:t>
       </w:r>
       <w:r>
         <w:rPr>
@@ -2865,31 +3088,95 @@
         <w:rPr>
           <w:lang w:eastAsia="es-ES" w:bidi="ar-SA"/>
         </w:rPr>
-        <w:t>Para terminar este apartado, quiero recalcar que en este Asset se ha trabajado con el</w:t>
-      </w:r>
-      <w:r>
-        <w:rPr>
-          <w:lang w:eastAsia="es-ES" w:bidi="ar-SA"/>
-        </w:rPr>
-        <w:t xml:space="preserve"> </w:t>
-      </w:r>
-      <w:r>
-        <w:rPr>
-          <w:lang w:eastAsia="es-ES" w:bidi="ar-SA"/>
-        </w:rPr>
-        <w:t>hand-tracking, usando para ello la tecnología usada por Oculus Quest II, ahora conocido</w:t>
-      </w:r>
-      <w:r>
-        <w:rPr>
-          <w:lang w:eastAsia="es-ES" w:bidi="ar-SA"/>
-        </w:rPr>
-        <w:t xml:space="preserve"> </w:t>
-      </w:r>
-      <w:r>
-        <w:rPr>
-          <w:lang w:eastAsia="es-ES" w:bidi="ar-SA"/>
-        </w:rPr>
-        <w:t>como Meta Quest 2 desde el renombramiento de la compañía desarrolladora el 28 de</w:t>
+        <w:t xml:space="preserve">Para terminar este apartado, quiero recalcar que en este </w:t>
+      </w:r>
+      <w:proofErr w:type="spellStart"/>
+      <w:r>
+        <w:rPr>
+          <w:lang w:eastAsia="es-ES" w:bidi="ar-SA"/>
+        </w:rPr>
+        <w:t>Asset</w:t>
+      </w:r>
+      <w:proofErr w:type="spellEnd"/>
+      <w:r>
+        <w:rPr>
+          <w:lang w:eastAsia="es-ES" w:bidi="ar-SA"/>
+        </w:rPr>
+        <w:t xml:space="preserve"> se ha trabajado con el</w:t>
+      </w:r>
+      <w:r>
+        <w:rPr>
+          <w:lang w:eastAsia="es-ES" w:bidi="ar-SA"/>
+        </w:rPr>
+        <w:t xml:space="preserve"> </w:t>
+      </w:r>
+      <w:proofErr w:type="spellStart"/>
+      <w:r>
+        <w:rPr>
+          <w:lang w:eastAsia="es-ES" w:bidi="ar-SA"/>
+        </w:rPr>
+        <w:t>hand</w:t>
+      </w:r>
+      <w:proofErr w:type="spellEnd"/>
+      <w:r>
+        <w:rPr>
+          <w:lang w:eastAsia="es-ES" w:bidi="ar-SA"/>
+        </w:rPr>
+        <w:t xml:space="preserve">-tracking, usando para ello la tecnología usada por </w:t>
+      </w:r>
+      <w:proofErr w:type="spellStart"/>
+      <w:r>
+        <w:rPr>
+          <w:lang w:eastAsia="es-ES" w:bidi="ar-SA"/>
+        </w:rPr>
+        <w:t>Oculus</w:t>
+      </w:r>
+      <w:proofErr w:type="spellEnd"/>
+      <w:r>
+        <w:rPr>
+          <w:lang w:eastAsia="es-ES" w:bidi="ar-SA"/>
+        </w:rPr>
+        <w:t xml:space="preserve"> </w:t>
+      </w:r>
+      <w:proofErr w:type="spellStart"/>
+      <w:r>
+        <w:rPr>
+          <w:lang w:eastAsia="es-ES" w:bidi="ar-SA"/>
+        </w:rPr>
+        <w:t>Quest</w:t>
+      </w:r>
+      <w:proofErr w:type="spellEnd"/>
+      <w:r>
+        <w:rPr>
+          <w:lang w:eastAsia="es-ES" w:bidi="ar-SA"/>
+        </w:rPr>
+        <w:t xml:space="preserve"> II, ahora conocido</w:t>
+      </w:r>
+      <w:r>
+        <w:rPr>
+          <w:lang w:eastAsia="es-ES" w:bidi="ar-SA"/>
+        </w:rPr>
+        <w:t xml:space="preserve"> </w:t>
+      </w:r>
+      <w:r>
+        <w:rPr>
+          <w:lang w:eastAsia="es-ES" w:bidi="ar-SA"/>
+        </w:rPr>
+        <w:t xml:space="preserve">como Meta </w:t>
+      </w:r>
+      <w:proofErr w:type="spellStart"/>
+      <w:r>
+        <w:rPr>
+          <w:lang w:eastAsia="es-ES" w:bidi="ar-SA"/>
+        </w:rPr>
+        <w:t>Quest</w:t>
+      </w:r>
+      <w:proofErr w:type="spellEnd"/>
+      <w:r>
+        <w:rPr>
+          <w:lang w:eastAsia="es-ES" w:bidi="ar-SA"/>
+        </w:rPr>
+        <w:t xml:space="preserve"> 2 desde el renombramiento de la compañía desarrolladora el 28 de</w:t>
       </w:r>
       <w:r>
         <w:rPr>
@@ -2915,21 +3202,45 @@
       <w:pPr>
         <w:pStyle w:val="Ttulo3"/>
       </w:pPr>
-      <w:r>
-        <w:t>Voice Recognition</w:t>
-      </w:r>
-    </w:p>
-    <w:p>
-      <w:pPr>
-        <w:rPr>
-          <w:lang w:eastAsia="es-ES" w:bidi="ar-SA"/>
-        </w:rPr>
-      </w:pPr>
-      <w:r>
-        <w:rPr>
-          <w:lang w:eastAsia="es-ES" w:bidi="ar-SA"/>
-        </w:rPr>
-        <w:t>Esta es otra tecnología que es bastante relevante en las NUIs para VR, aunque no</w:t>
+      <w:proofErr w:type="spellStart"/>
+      <w:r>
+        <w:t>Voice</w:t>
+      </w:r>
+      <w:proofErr w:type="spellEnd"/>
+      <w:r>
+        <w:t xml:space="preserve"> </w:t>
+      </w:r>
+      <w:proofErr w:type="spellStart"/>
+      <w:r>
+        <w:t>Recognition</w:t>
+      </w:r>
+      <w:proofErr w:type="spellEnd"/>
+    </w:p>
+    <w:p>
+      <w:pPr>
+        <w:rPr>
+          <w:lang w:eastAsia="es-ES" w:bidi="ar-SA"/>
+        </w:rPr>
+      </w:pPr>
+      <w:r>
+        <w:rPr>
+          <w:lang w:eastAsia="es-ES" w:bidi="ar-SA"/>
+        </w:rPr>
+        <w:t xml:space="preserve">Esta es otra tecnología que es bastante relevante en las </w:t>
+      </w:r>
+      <w:proofErr w:type="spellStart"/>
+      <w:r>
+        <w:rPr>
+          <w:lang w:eastAsia="es-ES" w:bidi="ar-SA"/>
+        </w:rPr>
+        <w:t>NUIs</w:t>
+      </w:r>
+      <w:proofErr w:type="spellEnd"/>
+      <w:r>
+        <w:rPr>
+          <w:lang w:eastAsia="es-ES" w:bidi="ar-SA"/>
+        </w:rPr>
+        <w:t xml:space="preserve"> para VR, aunque no</w:t>
       </w:r>
       <w:r>
         <w:rPr>
@@ -2989,13 +3300,7 @@
         <w:rPr>
           <w:lang w:eastAsia="es-ES" w:bidi="ar-SA"/>
         </w:rPr>
-        <w:t>suele</w:t>
-      </w:r>
-      <w:r>
-        <w:rPr>
-          <w:lang w:eastAsia="es-ES" w:bidi="ar-SA"/>
-        </w:rPr>
-        <w:t xml:space="preserve"> combinar junto a otras para ampliar las posibilidades de interacción natural y accesibilidad.</w:t>
+        <w:t>suele combinar junto a otras para ampliar las posibilidades de interacción natural y accesibilidad.</w:t>
       </w:r>
       <w:r>
         <w:rPr>
@@ -3033,8 +3338,13 @@
       <w:pPr>
         <w:pStyle w:val="Ttulo3"/>
       </w:pPr>
-      <w:r>
-        <w:t>Eye Tracking</w:t>
+      <w:proofErr w:type="spellStart"/>
+      <w:r>
+        <w:t>Eye</w:t>
+      </w:r>
+      <w:proofErr w:type="spellEnd"/>
+      <w:r>
+        <w:t xml:space="preserve"> Tracking</w:t>
       </w:r>
     </w:p>
     <w:p>
@@ -3083,19 +3393,7 @@
         <w:rPr>
           <w:lang w:eastAsia="es-ES" w:bidi="ar-SA"/>
         </w:rPr>
-        <w:t xml:space="preserve">mencionadas, para hacer experiencias </w:t>
-      </w:r>
-      <w:r>
-        <w:rPr>
-          <w:lang w:eastAsia="es-ES" w:bidi="ar-SA"/>
-        </w:rPr>
-        <w:t>aún</w:t>
-      </w:r>
-      <w:r>
-        <w:rPr>
-          <w:lang w:eastAsia="es-ES" w:bidi="ar-SA"/>
-        </w:rPr>
-        <w:t xml:space="preserve"> más inmersivas y e</w:t>
+        <w:t>mencionadas, para hacer experiencias aún más inmersivas y e</w:t>
       </w:r>
       <w:r>
         <w:rPr>
@@ -3169,21 +3467,40 @@
       <w:pPr>
         <w:pStyle w:val="Ttulo3"/>
       </w:pPr>
-      <w:r>
-        <w:t>Body Tracking</w:t>
-      </w:r>
-    </w:p>
-    <w:p>
-      <w:pPr>
-        <w:rPr>
-          <w:lang w:eastAsia="es-ES" w:bidi="ar-SA"/>
-        </w:rPr>
-      </w:pPr>
-      <w:r>
-        <w:rPr>
-          <w:lang w:eastAsia="es-ES" w:bidi="ar-SA"/>
-        </w:rPr>
-        <w:t>El body tracking, como el nombre indica, se trata de la detección de posturas y gestos</w:t>
+      <w:proofErr w:type="spellStart"/>
+      <w:r>
+        <w:t>Body</w:t>
+      </w:r>
+      <w:proofErr w:type="spellEnd"/>
+      <w:r>
+        <w:t xml:space="preserve"> Tracking</w:t>
+      </w:r>
+    </w:p>
+    <w:p>
+      <w:pPr>
+        <w:rPr>
+          <w:lang w:eastAsia="es-ES" w:bidi="ar-SA"/>
+        </w:rPr>
+      </w:pPr>
+      <w:r>
+        <w:rPr>
+          <w:lang w:eastAsia="es-ES" w:bidi="ar-SA"/>
+        </w:rPr>
+        <w:t xml:space="preserve">El </w:t>
+      </w:r>
+      <w:proofErr w:type="spellStart"/>
+      <w:r>
+        <w:rPr>
+          <w:lang w:eastAsia="es-ES" w:bidi="ar-SA"/>
+        </w:rPr>
+        <w:t>body</w:t>
+      </w:r>
+      <w:proofErr w:type="spellEnd"/>
+      <w:r>
+        <w:rPr>
+          <w:lang w:eastAsia="es-ES" w:bidi="ar-SA"/>
+        </w:rPr>
+        <w:t xml:space="preserve"> tracking, como el nombre indica, se trata de la detección de posturas y gestos</w:t>
       </w:r>
       <w:r>
         <w:rPr>
@@ -3243,7 +3560,21 @@
         <w:rPr>
           <w:lang w:eastAsia="es-ES" w:bidi="ar-SA"/>
         </w:rPr>
-        <w:t>combinado con el hand tracking elimina gran cantidad de dispositivos y permiten mucha</w:t>
+        <w:t xml:space="preserve">combinado con el </w:t>
+      </w:r>
+      <w:proofErr w:type="spellStart"/>
+      <w:r>
+        <w:rPr>
+          <w:lang w:eastAsia="es-ES" w:bidi="ar-SA"/>
+        </w:rPr>
+        <w:t>hand</w:t>
+      </w:r>
+      <w:proofErr w:type="spellEnd"/>
+      <w:r>
+        <w:rPr>
+          <w:lang w:eastAsia="es-ES" w:bidi="ar-SA"/>
+        </w:rPr>
+        <w:t xml:space="preserve"> tracking elimina gran cantidad de dispositivos y permiten mucha</w:t>
       </w:r>
       <w:r>
         <w:rPr>
@@ -3304,19 +3635,35 @@
         <w:rPr>
           <w:lang w:eastAsia="es-ES" w:bidi="ar-SA"/>
         </w:rPr>
-        <w:t>y fácilmente accesibles, incluso en situaciones donde el usuario emplea un head-mounted</w:t>
-      </w:r>
+        <w:t>y fácilmente accesibles, incluso en situaciones donde el usuario emplea un head-</w:t>
+      </w:r>
+      <w:proofErr w:type="spellStart"/>
+      <w:r>
+        <w:rPr>
+          <w:lang w:eastAsia="es-ES" w:bidi="ar-SA"/>
+        </w:rPr>
+        <w:t>mounted</w:t>
+      </w:r>
+      <w:proofErr w:type="spellEnd"/>
       <w:r>
         <w:rPr>
           <w:lang w:eastAsia="es-ES" w:bidi="ar-SA"/>
         </w:rPr>
         <w:t>-</w:t>
       </w:r>
-      <w:r>
-        <w:rPr>
-          <w:lang w:eastAsia="es-ES" w:bidi="ar-SA"/>
-        </w:rPr>
-        <w:t>display (HMD). [24] [25]</w:t>
+      <w:proofErr w:type="spellStart"/>
+      <w:r>
+        <w:rPr>
+          <w:lang w:eastAsia="es-ES" w:bidi="ar-SA"/>
+        </w:rPr>
+        <w:t>display</w:t>
+      </w:r>
+      <w:proofErr w:type="spellEnd"/>
+      <w:r>
+        <w:rPr>
+          <w:lang w:eastAsia="es-ES" w:bidi="ar-SA"/>
+        </w:rPr>
+        <w:t xml:space="preserve"> (HMD). [24] [25]</w:t>
       </w:r>
     </w:p>
     <w:p>
@@ -3357,19 +3704,55 @@
         <w:rPr>
           <w:lang w:eastAsia="es-ES" w:bidi="ar-SA"/>
         </w:rPr>
-        <w:t>ha hecho uso de NUIs. He preparado el Asset del teclado para poder interactuar con el</w:t>
-      </w:r>
-      <w:r>
-        <w:rPr>
-          <w:lang w:eastAsia="es-ES" w:bidi="ar-SA"/>
-        </w:rPr>
-        <w:t xml:space="preserve"> </w:t>
-      </w:r>
-      <w:r>
-        <w:rPr>
-          <w:lang w:eastAsia="es-ES" w:bidi="ar-SA"/>
-        </w:rPr>
-        <w:t>hand tracking y así hacerlo más cómodo para personas ajenas al VR, pero que al menos</w:t>
+        <w:t xml:space="preserve">ha hecho uso de </w:t>
+      </w:r>
+      <w:proofErr w:type="spellStart"/>
+      <w:r>
+        <w:rPr>
+          <w:lang w:eastAsia="es-ES" w:bidi="ar-SA"/>
+        </w:rPr>
+        <w:t>NUIs</w:t>
+      </w:r>
+      <w:proofErr w:type="spellEnd"/>
+      <w:r>
+        <w:rPr>
+          <w:lang w:eastAsia="es-ES" w:bidi="ar-SA"/>
+        </w:rPr>
+        <w:t xml:space="preserve">. He preparado el </w:t>
+      </w:r>
+      <w:proofErr w:type="spellStart"/>
+      <w:r>
+        <w:rPr>
+          <w:lang w:eastAsia="es-ES" w:bidi="ar-SA"/>
+        </w:rPr>
+        <w:t>Asset</w:t>
+      </w:r>
+      <w:proofErr w:type="spellEnd"/>
+      <w:r>
+        <w:rPr>
+          <w:lang w:eastAsia="es-ES" w:bidi="ar-SA"/>
+        </w:rPr>
+        <w:t xml:space="preserve"> del teclado para poder interactuar con el</w:t>
+      </w:r>
+      <w:r>
+        <w:rPr>
+          <w:lang w:eastAsia="es-ES" w:bidi="ar-SA"/>
+        </w:rPr>
+        <w:t xml:space="preserve"> </w:t>
+      </w:r>
+      <w:proofErr w:type="spellStart"/>
+      <w:r>
+        <w:rPr>
+          <w:lang w:eastAsia="es-ES" w:bidi="ar-SA"/>
+        </w:rPr>
+        <w:t>hand</w:t>
+      </w:r>
+      <w:proofErr w:type="spellEnd"/>
+      <w:r>
+        <w:rPr>
+          <w:lang w:eastAsia="es-ES" w:bidi="ar-SA"/>
+        </w:rPr>
+        <w:t xml:space="preserve"> tracking y así hacerlo más cómodo para personas ajenas al VR, pero que al menos</w:t>
       </w:r>
       <w:r>
         <w:rPr>
@@ -3417,7 +3800,21 @@
         <w:rPr>
           <w:lang w:eastAsia="es-ES" w:bidi="ar-SA"/>
         </w:rPr>
-        <w:t xml:space="preserve"> meta Quest 2, por lo que no se ha podido corroborar el funcionamiento</w:t>
+        <w:t xml:space="preserve"> meta </w:t>
+      </w:r>
+      <w:proofErr w:type="spellStart"/>
+      <w:r>
+        <w:rPr>
+          <w:lang w:eastAsia="es-ES" w:bidi="ar-SA"/>
+        </w:rPr>
+        <w:t>Quest</w:t>
+      </w:r>
+      <w:proofErr w:type="spellEnd"/>
+      <w:r>
+        <w:rPr>
+          <w:lang w:eastAsia="es-ES" w:bidi="ar-SA"/>
+        </w:rPr>
+        <w:t xml:space="preserve"> 2, por lo que no se ha podido corroborar el funcionamiento</w:t>
       </w:r>
       <w:r>
         <w:rPr>
@@ -3441,8 +3838,30 @@
         <w:rPr>
           <w:lang w:eastAsia="es-ES" w:bidi="ar-SA"/>
         </w:rPr>
-        <w:t>VR Interaction Toolkit</w:t>
-      </w:r>
+        <w:t xml:space="preserve">VR </w:t>
+      </w:r>
+      <w:proofErr w:type="spellStart"/>
+      <w:r>
+        <w:rPr>
+          <w:lang w:eastAsia="es-ES" w:bidi="ar-SA"/>
+        </w:rPr>
+        <w:t>Interaction</w:t>
+      </w:r>
+      <w:proofErr w:type="spellEnd"/>
+      <w:r>
+        <w:rPr>
+          <w:lang w:eastAsia="es-ES" w:bidi="ar-SA"/>
+        </w:rPr>
+        <w:t xml:space="preserve"> </w:t>
+      </w:r>
+      <w:proofErr w:type="spellStart"/>
+      <w:r>
+        <w:rPr>
+          <w:lang w:eastAsia="es-ES" w:bidi="ar-SA"/>
+        </w:rPr>
+        <w:t>Toolkit</w:t>
+      </w:r>
+      <w:proofErr w:type="spellEnd"/>
       <w:r>
         <w:rPr>
           <w:lang w:eastAsia="es-ES" w:bidi="ar-SA"/>
@@ -3453,8 +3872,30 @@
         <w:rPr>
           <w:lang w:eastAsia="es-ES" w:bidi="ar-SA"/>
         </w:rPr>
-        <w:t xml:space="preserve"> de Unity, herramienta que ofrece soporte a la mayoria de HUDs</w:t>
-      </w:r>
+        <w:t xml:space="preserve"> de Unity, herramienta que ofrece soporte a la </w:t>
+      </w:r>
+      <w:proofErr w:type="spellStart"/>
+      <w:r>
+        <w:rPr>
+          <w:lang w:eastAsia="es-ES" w:bidi="ar-SA"/>
+        </w:rPr>
+        <w:t>mayoria</w:t>
+      </w:r>
+      <w:proofErr w:type="spellEnd"/>
+      <w:r>
+        <w:rPr>
+          <w:lang w:eastAsia="es-ES" w:bidi="ar-SA"/>
+        </w:rPr>
+        <w:t xml:space="preserve"> de </w:t>
+      </w:r>
+      <w:proofErr w:type="spellStart"/>
+      <w:r>
+        <w:rPr>
+          <w:lang w:eastAsia="es-ES" w:bidi="ar-SA"/>
+        </w:rPr>
+        <w:t>HUDs</w:t>
+      </w:r>
+      <w:proofErr w:type="spellEnd"/>
       <w:r>
         <w:rPr>
           <w:lang w:eastAsia="es-ES" w:bidi="ar-SA"/>
@@ -3582,11 +4023,19 @@
           <w:lang w:eastAsia="es-ES" w:bidi="ar-SA"/>
         </w:rPr>
       </w:pPr>
-      <w:r>
-        <w:rPr>
-          <w:lang w:eastAsia="es-ES" w:bidi="ar-SA"/>
-        </w:rPr>
-        <w:t>NUIs como el control mediante gestos de manos, recrean la experiencia de tocar un</w:t>
+      <w:proofErr w:type="spellStart"/>
+      <w:r>
+        <w:rPr>
+          <w:lang w:eastAsia="es-ES" w:bidi="ar-SA"/>
+        </w:rPr>
+        <w:t>NUIs</w:t>
+      </w:r>
+      <w:proofErr w:type="spellEnd"/>
+      <w:r>
+        <w:rPr>
+          <w:lang w:eastAsia="es-ES" w:bidi="ar-SA"/>
+        </w:rPr>
+        <w:t xml:space="preserve"> como el control mediante gestos de manos, recrean la experiencia de tocar un</w:t>
       </w:r>
       <w:r>
         <w:rPr>
@@ -3982,6 +4431,7 @@
         </w:rPr>
         <w:t xml:space="preserve">tradicionales carecen de </w:t>
       </w:r>
+      <w:proofErr w:type="spellStart"/>
       <w:r>
         <w:rPr>
           <w:lang w:eastAsia="es-ES" w:bidi="ar-SA"/>
@@ -3992,7 +4442,14 @@
         <w:rPr>
           <w:lang w:eastAsia="es-ES" w:bidi="ar-SA"/>
         </w:rPr>
-        <w:t>exibilidad para adaptarse a las necesidades individuales [29][30].</w:t>
+        <w:t>exibilidad</w:t>
+      </w:r>
+      <w:proofErr w:type="spellEnd"/>
+      <w:r>
+        <w:rPr>
+          <w:lang w:eastAsia="es-ES" w:bidi="ar-SA"/>
+        </w:rPr>
+        <w:t xml:space="preserve"> para adaptarse a las necesidades individuales [29][30].</w:t>
       </w:r>
     </w:p>
     <w:p>
@@ -4172,7 +4629,21 @@
         <w:rPr>
           <w:lang w:eastAsia="es-ES" w:bidi="ar-SA"/>
         </w:rPr>
-        <w:t>usuarios de experiencias inmersivas. Por ejemplo, la falta de feedback háptico o de interfaces</w:t>
+        <w:t xml:space="preserve">usuarios de experiencias inmersivas. Por ejemplo, la falta de </w:t>
+      </w:r>
+      <w:proofErr w:type="spellStart"/>
+      <w:r>
+        <w:rPr>
+          <w:lang w:eastAsia="es-ES" w:bidi="ar-SA"/>
+        </w:rPr>
+        <w:t>feedback</w:t>
+      </w:r>
+      <w:proofErr w:type="spellEnd"/>
+      <w:r>
+        <w:rPr>
+          <w:lang w:eastAsia="es-ES" w:bidi="ar-SA"/>
+        </w:rPr>
+        <w:t xml:space="preserve"> háptico o de interfaces</w:t>
       </w:r>
       <w:r>
         <w:rPr>
@@ -4216,8 +4687,30 @@
         <w:rPr>
           <w:lang w:eastAsia="es-ES" w:bidi="ar-SA"/>
         </w:rPr>
-        <w:t>La implementación de feedback multimodal, que fusiona estímulos auditivos, vibrotáctiles</w:t>
-      </w:r>
+        <w:t xml:space="preserve">La implementación de </w:t>
+      </w:r>
+      <w:proofErr w:type="spellStart"/>
+      <w:r>
+        <w:rPr>
+          <w:lang w:eastAsia="es-ES" w:bidi="ar-SA"/>
+        </w:rPr>
+        <w:t>feedback</w:t>
+      </w:r>
+      <w:proofErr w:type="spellEnd"/>
+      <w:r>
+        <w:rPr>
+          <w:lang w:eastAsia="es-ES" w:bidi="ar-SA"/>
+        </w:rPr>
+        <w:t xml:space="preserve"> multimodal, que fusiona estímulos auditivos, </w:t>
+      </w:r>
+      <w:proofErr w:type="spellStart"/>
+      <w:r>
+        <w:rPr>
+          <w:lang w:eastAsia="es-ES" w:bidi="ar-SA"/>
+        </w:rPr>
+        <w:t>vibrotáctiles</w:t>
+      </w:r>
+      <w:proofErr w:type="spellEnd"/>
       <w:r>
         <w:rPr>
           <w:lang w:eastAsia="es-ES" w:bidi="ar-SA"/>
@@ -4490,7 +4983,21 @@
         <w:rPr>
           <w:lang w:eastAsia="es-ES" w:bidi="ar-SA"/>
         </w:rPr>
-        <w:t>ausencia de feedback tangible, como el que se recibe en teclados convencionales, puede</w:t>
+        <w:t xml:space="preserve">ausencia de </w:t>
+      </w:r>
+      <w:proofErr w:type="spellStart"/>
+      <w:r>
+        <w:rPr>
+          <w:lang w:eastAsia="es-ES" w:bidi="ar-SA"/>
+        </w:rPr>
+        <w:t>feedback</w:t>
+      </w:r>
+      <w:proofErr w:type="spellEnd"/>
+      <w:r>
+        <w:rPr>
+          <w:lang w:eastAsia="es-ES" w:bidi="ar-SA"/>
+        </w:rPr>
+        <w:t xml:space="preserve"> tangible, como el que se recibe en teclados convencionales, puede</w:t>
       </w:r>
       <w:r>
         <w:rPr>
@@ -4538,7 +5045,21 @@
         <w:rPr>
           <w:lang w:eastAsia="es-ES" w:bidi="ar-SA"/>
         </w:rPr>
-        <w:t>y micro-altavoces para simular vibraciones similares a las de</w:t>
+        <w:t xml:space="preserve">y </w:t>
+      </w:r>
+      <w:proofErr w:type="spellStart"/>
+      <w:r>
+        <w:rPr>
+          <w:lang w:eastAsia="es-ES" w:bidi="ar-SA"/>
+        </w:rPr>
+        <w:t>micro-altavoces</w:t>
+      </w:r>
+      <w:proofErr w:type="spellEnd"/>
+      <w:r>
+        <w:rPr>
+          <w:lang w:eastAsia="es-ES" w:bidi="ar-SA"/>
+        </w:rPr>
+        <w:t xml:space="preserve"> para simular vibraciones similares a las de</w:t>
       </w:r>
       <w:r>
         <w:rPr>
@@ -4626,12 +5147,14 @@
         </w:rPr>
         <w:t>“</w:t>
       </w:r>
+      <w:proofErr w:type="spellStart"/>
       <w:r>
         <w:rPr>
           <w:lang w:eastAsia="es-ES" w:bidi="ar-SA"/>
         </w:rPr>
         <w:t>tap</w:t>
       </w:r>
+      <w:proofErr w:type="spellEnd"/>
       <w:r>
         <w:rPr>
           <w:lang w:eastAsia="es-ES" w:bidi="ar-SA"/>
@@ -4654,7 +5177,21 @@
         <w:rPr>
           <w:lang w:eastAsia="es-ES" w:bidi="ar-SA"/>
         </w:rPr>
-        <w:t>superior en comparación con los teclados de gestos (swipe) en Realidad Virtual, además</w:t>
+        <w:t>superior en comparación con los teclados de gestos (</w:t>
+      </w:r>
+      <w:proofErr w:type="spellStart"/>
+      <w:r>
+        <w:rPr>
+          <w:lang w:eastAsia="es-ES" w:bidi="ar-SA"/>
+        </w:rPr>
+        <w:t>swipe</w:t>
+      </w:r>
+      <w:proofErr w:type="spellEnd"/>
+      <w:r>
+        <w:rPr>
+          <w:lang w:eastAsia="es-ES" w:bidi="ar-SA"/>
+        </w:rPr>
+        <w:t>) en Realidad Virtual, además</w:t>
       </w:r>
       <w:r>
         <w:rPr>
@@ -4678,19 +5215,7 @@
         <w:rPr>
           <w:lang w:eastAsia="es-ES" w:bidi="ar-SA"/>
         </w:rPr>
-        <w:t xml:space="preserve">metáforas de </w:t>
-      </w:r>
-      <w:r>
-        <w:rPr>
-          <w:lang w:eastAsia="es-ES" w:bidi="ar-SA"/>
-        </w:rPr>
-        <w:t>entretenimiento (</w:t>
-      </w:r>
-      <w:r>
-        <w:rPr>
-          <w:lang w:eastAsia="es-ES" w:bidi="ar-SA"/>
-        </w:rPr>
-        <w:t>como el teclado de batería), han demostrado ser e</w:t>
+        <w:t>metáforas de entretenimiento (como el teclado de batería), han demostrado ser e</w:t>
       </w:r>
       <w:r>
         <w:rPr>
@@ -4726,7 +5251,21 @@
         <w:rPr>
           <w:lang w:eastAsia="es-ES" w:bidi="ar-SA"/>
         </w:rPr>
-        <w:t>futuras [37]. La incorporación de feedback háptico y visual, además de la personalización</w:t>
+        <w:t xml:space="preserve">futuras [37]. La incorporación de </w:t>
+      </w:r>
+      <w:proofErr w:type="spellStart"/>
+      <w:r>
+        <w:rPr>
+          <w:lang w:eastAsia="es-ES" w:bidi="ar-SA"/>
+        </w:rPr>
+        <w:t>feedback</w:t>
+      </w:r>
+      <w:proofErr w:type="spellEnd"/>
+      <w:r>
+        <w:rPr>
+          <w:lang w:eastAsia="es-ES" w:bidi="ar-SA"/>
+        </w:rPr>
+        <w:t xml:space="preserve"> háptico y visual, además de la personalización</w:t>
       </w:r>
       <w:r>
         <w:rPr>
@@ -5058,7 +5597,21 @@
         <w:rPr>
           <w:lang w:eastAsia="es-ES" w:bidi="ar-SA"/>
         </w:rPr>
-        <w:t>En primer lugar, la característica del teclado que mas contribuye a este apartado es</w:t>
+        <w:t xml:space="preserve">En primer lugar, la característica del teclado que </w:t>
+      </w:r>
+      <w:proofErr w:type="spellStart"/>
+      <w:r>
+        <w:rPr>
+          <w:lang w:eastAsia="es-ES" w:bidi="ar-SA"/>
+        </w:rPr>
+        <w:t>mas</w:t>
+      </w:r>
+      <w:proofErr w:type="spellEnd"/>
+      <w:r>
+        <w:rPr>
+          <w:lang w:eastAsia="es-ES" w:bidi="ar-SA"/>
+        </w:rPr>
+        <w:t xml:space="preserve"> contribuye a este apartado es</w:t>
       </w:r>
       <w:r>
         <w:rPr>
@@ -5082,7 +5635,21 @@
         <w:rPr>
           <w:lang w:eastAsia="es-ES" w:bidi="ar-SA"/>
         </w:rPr>
-        <w:t>distintos al latinoamericano, o el anglosajón, como son el cirílico, el hangul, el griego o</w:t>
+        <w:t xml:space="preserve">distintos al latinoamericano, o el anglosajón, como son el cirílico, el </w:t>
+      </w:r>
+      <w:proofErr w:type="spellStart"/>
+      <w:r>
+        <w:rPr>
+          <w:lang w:eastAsia="es-ES" w:bidi="ar-SA"/>
+        </w:rPr>
+        <w:t>hangul</w:t>
+      </w:r>
+      <w:proofErr w:type="spellEnd"/>
+      <w:r>
+        <w:rPr>
+          <w:lang w:eastAsia="es-ES" w:bidi="ar-SA"/>
+        </w:rPr>
+        <w:t>, el griego o</w:t>
       </w:r>
       <w:r>
         <w:rPr>
@@ -5138,7 +5705,21 @@
         <w:rPr>
           <w:lang w:eastAsia="es-ES" w:bidi="ar-SA"/>
         </w:rPr>
-        <w:t>funcionar con hand tracking. Esto afecta tanto a individuos que, por diferentes motivos,</w:t>
+        <w:t xml:space="preserve">funcionar con </w:t>
+      </w:r>
+      <w:proofErr w:type="spellStart"/>
+      <w:r>
+        <w:rPr>
+          <w:lang w:eastAsia="es-ES" w:bidi="ar-SA"/>
+        </w:rPr>
+        <w:t>hand</w:t>
+      </w:r>
+      <w:proofErr w:type="spellEnd"/>
+      <w:r>
+        <w:rPr>
+          <w:lang w:eastAsia="es-ES" w:bidi="ar-SA"/>
+        </w:rPr>
+        <w:t xml:space="preserve"> tracking. Esto afecta tanto a individuos que, por diferentes motivos,</w:t>
       </w:r>
       <w:r>
         <w:rPr>
@@ -5263,13 +5844,7 @@
         <w:rPr>
           <w:lang w:eastAsia="es-ES" w:bidi="ar-SA"/>
         </w:rPr>
-        <w:t>Los dos grandes caminos para seguir</w:t>
-      </w:r>
-      <w:r>
-        <w:rPr>
-          <w:lang w:eastAsia="es-ES" w:bidi="ar-SA"/>
-        </w:rPr>
-        <w:t xml:space="preserve"> para poder llegar a más gente son los siguientes:</w:t>
+        <w:t>Los dos grandes caminos para seguir para poder llegar a más gente son los siguientes:</w:t>
       </w:r>
     </w:p>
     <w:p>
@@ -5288,7 +5863,21 @@
           <w:lang w:eastAsia="es-ES" w:bidi="ar-SA"/>
         </w:rPr>
         <w:lastRenderedPageBreak/>
-        <w:t>Primero, se podría implementar una tecnología de SpeechToText que se activara</w:t>
+        <w:t xml:space="preserve">Primero, se podría implementar una tecnología de </w:t>
+      </w:r>
+      <w:proofErr w:type="spellStart"/>
+      <w:r>
+        <w:rPr>
+          <w:lang w:eastAsia="es-ES" w:bidi="ar-SA"/>
+        </w:rPr>
+        <w:t>SpeechToText</w:t>
+      </w:r>
+      <w:proofErr w:type="spellEnd"/>
+      <w:r>
+        <w:rPr>
+          <w:lang w:eastAsia="es-ES" w:bidi="ar-SA"/>
+        </w:rPr>
+        <w:t xml:space="preserve"> que se activara</w:t>
       </w:r>
       <w:r>
         <w:rPr>
@@ -5343,6 +5932,3017 @@
           <w:lang w:eastAsia="es-ES" w:bidi="ar-SA"/>
         </w:rPr>
         <w:t>que soportara el teclado.</w:t>
+      </w:r>
+    </w:p>
+    <w:p>
+      <w:pPr>
+        <w:rPr>
+          <w:lang w:eastAsia="es-ES" w:bidi="ar-SA"/>
+        </w:rPr>
+      </w:pPr>
+    </w:p>
+    <w:p>
+      <w:pPr>
+        <w:pStyle w:val="Ttulo1"/>
+        <w:numPr>
+          <w:ilvl w:val="0"/>
+          <w:numId w:val="0"/>
+        </w:numPr>
+      </w:pPr>
+      <w:r>
+        <w:t>2.7. Estándares y tendencias de mercado en VR</w:t>
+      </w:r>
+    </w:p>
+    <w:p>
+      <w:pPr>
+        <w:pStyle w:val="Ttulo2"/>
+      </w:pPr>
+      <w:r>
+        <w:t>2.7.1. Estado actual del mercado de VR</w:t>
+      </w:r>
+    </w:p>
+    <w:p>
+      <w:pPr>
+        <w:pStyle w:val="Ttulo3"/>
+      </w:pPr>
+      <w:r>
+        <w:t>Crecimiento del mercado de VR</w:t>
+      </w:r>
+    </w:p>
+    <w:p>
+      <w:pPr>
+        <w:rPr>
+          <w:lang w:eastAsia="es-ES" w:bidi="ar-SA"/>
+        </w:rPr>
+      </w:pPr>
+      <w:r>
+        <w:rPr>
+          <w:lang w:eastAsia="es-ES" w:bidi="ar-SA"/>
+        </w:rPr>
+        <w:t>El mercado global de la Realidad Virtual ha experimentado un crecimiento signi</w:t>
+      </w:r>
+      <w:r>
+        <w:rPr>
+          <w:lang w:eastAsia="es-ES" w:bidi="ar-SA"/>
+        </w:rPr>
+        <w:t>fi</w:t>
+      </w:r>
+      <w:r>
+        <w:rPr>
+          <w:lang w:eastAsia="es-ES" w:bidi="ar-SA"/>
+        </w:rPr>
+        <w:t>cativo</w:t>
+      </w:r>
+      <w:r>
+        <w:rPr>
+          <w:lang w:eastAsia="es-ES" w:bidi="ar-SA"/>
+        </w:rPr>
+        <w:t xml:space="preserve"> </w:t>
+      </w:r>
+      <w:r>
+        <w:rPr>
+          <w:lang w:eastAsia="es-ES" w:bidi="ar-SA"/>
+        </w:rPr>
+        <w:t>en los últimos años, impulsado por el desarrollo tecnológico y la aparición de dispositivos</w:t>
+      </w:r>
+      <w:r>
+        <w:rPr>
+          <w:lang w:eastAsia="es-ES" w:bidi="ar-SA"/>
+        </w:rPr>
+        <w:t xml:space="preserve"> </w:t>
+      </w:r>
+      <w:r>
+        <w:rPr>
+          <w:lang w:eastAsia="es-ES" w:bidi="ar-SA"/>
+        </w:rPr>
+        <w:t>más asequibles y accesibles para el consumidor. Se estima que el tamaño del mercado</w:t>
+      </w:r>
+      <w:r>
+        <w:rPr>
+          <w:lang w:eastAsia="es-ES" w:bidi="ar-SA"/>
+        </w:rPr>
+        <w:t xml:space="preserve"> </w:t>
+      </w:r>
+      <w:r>
+        <w:rPr>
+          <w:lang w:eastAsia="es-ES" w:bidi="ar-SA"/>
+        </w:rPr>
+        <w:t>mundial de VR aumentará de 7.3 mil millones de dólares en 2018 a 120.5 mil millones</w:t>
+      </w:r>
+      <w:r>
+        <w:rPr>
+          <w:lang w:eastAsia="es-ES" w:bidi="ar-SA"/>
+        </w:rPr>
+        <w:t xml:space="preserve"> </w:t>
+      </w:r>
+      <w:r>
+        <w:rPr>
+          <w:lang w:eastAsia="es-ES" w:bidi="ar-SA"/>
+        </w:rPr>
+        <w:t xml:space="preserve">de dólares en 2026, según un informe de </w:t>
+      </w:r>
+      <w:proofErr w:type="spellStart"/>
+      <w:r>
+        <w:rPr>
+          <w:lang w:eastAsia="es-ES" w:bidi="ar-SA"/>
+        </w:rPr>
+        <w:t>Fortune</w:t>
+      </w:r>
+      <w:proofErr w:type="spellEnd"/>
+      <w:r>
+        <w:rPr>
+          <w:lang w:eastAsia="es-ES" w:bidi="ar-SA"/>
+        </w:rPr>
+        <w:t xml:space="preserve"> Business </w:t>
+      </w:r>
+      <w:proofErr w:type="spellStart"/>
+      <w:r>
+        <w:rPr>
+          <w:lang w:eastAsia="es-ES" w:bidi="ar-SA"/>
+        </w:rPr>
+        <w:t>Insights</w:t>
+      </w:r>
+      <w:proofErr w:type="spellEnd"/>
+      <w:r>
+        <w:rPr>
+          <w:lang w:eastAsia="es-ES" w:bidi="ar-SA"/>
+        </w:rPr>
+        <w:t>, citado en el artículo</w:t>
+      </w:r>
+      <w:r>
+        <w:rPr>
+          <w:lang w:eastAsia="es-ES" w:bidi="ar-SA"/>
+        </w:rPr>
+        <w:t xml:space="preserve"> </w:t>
+      </w:r>
+      <w:r>
+        <w:rPr>
+          <w:lang w:eastAsia="es-ES" w:bidi="ar-SA"/>
+        </w:rPr>
+        <w:t xml:space="preserve">"Virtual </w:t>
+      </w:r>
+      <w:proofErr w:type="spellStart"/>
+      <w:r>
+        <w:rPr>
+          <w:lang w:eastAsia="es-ES" w:bidi="ar-SA"/>
+        </w:rPr>
+        <w:t>Reality</w:t>
+      </w:r>
+      <w:proofErr w:type="spellEnd"/>
+      <w:r>
+        <w:rPr>
+          <w:lang w:eastAsia="es-ES" w:bidi="ar-SA"/>
+        </w:rPr>
+        <w:t>"</w:t>
+      </w:r>
+      <w:r>
+        <w:rPr>
+          <w:lang w:eastAsia="es-ES" w:bidi="ar-SA"/>
+        </w:rPr>
+        <w:t xml:space="preserve"> </w:t>
+      </w:r>
+      <w:r>
+        <w:rPr>
+          <w:lang w:eastAsia="es-ES" w:bidi="ar-SA"/>
+        </w:rPr>
+        <w:t xml:space="preserve">de Isabell </w:t>
+      </w:r>
+      <w:proofErr w:type="spellStart"/>
+      <w:r>
+        <w:rPr>
+          <w:lang w:eastAsia="es-ES" w:bidi="ar-SA"/>
+        </w:rPr>
+        <w:t>Wohlgenannt</w:t>
+      </w:r>
+      <w:proofErr w:type="spellEnd"/>
+      <w:r>
+        <w:rPr>
+          <w:lang w:eastAsia="es-ES" w:bidi="ar-SA"/>
+        </w:rPr>
+        <w:t xml:space="preserve"> </w:t>
+      </w:r>
+      <w:r>
+        <w:rPr>
+          <w:lang w:eastAsia="es-ES" w:bidi="ar-SA"/>
+        </w:rPr>
+        <w:t>y</w:t>
+      </w:r>
+      <w:r>
+        <w:rPr>
+          <w:lang w:eastAsia="es-ES" w:bidi="ar-SA"/>
+        </w:rPr>
+        <w:t xml:space="preserve"> Alexander Simons and Stefan </w:t>
+      </w:r>
+      <w:proofErr w:type="spellStart"/>
+      <w:r>
+        <w:rPr>
+          <w:lang w:eastAsia="es-ES" w:bidi="ar-SA"/>
+        </w:rPr>
+        <w:t>Stieglitz</w:t>
+      </w:r>
+      <w:proofErr w:type="spellEnd"/>
+      <w:r>
+        <w:rPr>
+          <w:lang w:eastAsia="es-ES" w:bidi="ar-SA"/>
+        </w:rPr>
+        <w:t xml:space="preserve"> [40],</w:t>
+      </w:r>
+      <w:r>
+        <w:rPr>
+          <w:lang w:eastAsia="es-ES" w:bidi="ar-SA"/>
+        </w:rPr>
+        <w:t xml:space="preserve"> </w:t>
+      </w:r>
+      <w:r>
+        <w:rPr>
+          <w:lang w:eastAsia="es-ES" w:bidi="ar-SA"/>
+        </w:rPr>
+        <w:t xml:space="preserve">lo que </w:t>
+      </w:r>
+      <w:r>
+        <w:rPr>
+          <w:lang w:eastAsia="es-ES" w:bidi="ar-SA"/>
+        </w:rPr>
+        <w:t>re</w:t>
+      </w:r>
+      <w:r>
+        <w:rPr>
+          <w:lang w:eastAsia="es-ES" w:bidi="ar-SA"/>
+        </w:rPr>
+        <w:t>fl</w:t>
+      </w:r>
+      <w:r>
+        <w:rPr>
+          <w:lang w:eastAsia="es-ES" w:bidi="ar-SA"/>
+        </w:rPr>
+        <w:t>eja</w:t>
+      </w:r>
+      <w:r>
+        <w:rPr>
+          <w:lang w:eastAsia="es-ES" w:bidi="ar-SA"/>
+        </w:rPr>
+        <w:t xml:space="preserve"> una tendencia de crecimiento acelerado y sostenido hacia 2024 y 2025.</w:t>
+      </w:r>
+      <w:r>
+        <w:rPr>
+          <w:lang w:eastAsia="es-ES" w:bidi="ar-SA"/>
+        </w:rPr>
+        <w:t xml:space="preserve"> </w:t>
+      </w:r>
+      <w:r>
+        <w:rPr>
+          <w:lang w:eastAsia="es-ES" w:bidi="ar-SA"/>
+        </w:rPr>
+        <w:t>Este crecimiento está motivado principalmente por el sector de software de consumo,</w:t>
+      </w:r>
+    </w:p>
+    <w:p>
+      <w:pPr>
+        <w:rPr>
+          <w:lang w:eastAsia="es-ES" w:bidi="ar-SA"/>
+        </w:rPr>
+      </w:pPr>
+      <w:r>
+        <w:rPr>
+          <w:lang w:eastAsia="es-ES" w:bidi="ar-SA"/>
+        </w:rPr>
+        <w:t>especialmente los videojuegos, aunque también se observa una expansión en aplicaciones</w:t>
+      </w:r>
+      <w:r>
+        <w:rPr>
+          <w:lang w:eastAsia="es-ES" w:bidi="ar-SA"/>
+        </w:rPr>
+        <w:t xml:space="preserve"> </w:t>
+      </w:r>
+      <w:r>
+        <w:rPr>
+          <w:lang w:eastAsia="es-ES" w:bidi="ar-SA"/>
+        </w:rPr>
+        <w:t>empresariales y de marketing.[40] [41]</w:t>
+      </w:r>
+    </w:p>
+    <w:p>
+      <w:pPr>
+        <w:pStyle w:val="Ttulo3"/>
+      </w:pPr>
+      <w:r>
+        <w:t xml:space="preserve">Aumento de dispositivos </w:t>
+      </w:r>
+      <w:proofErr w:type="spellStart"/>
+      <w:r>
+        <w:t>standalone</w:t>
+      </w:r>
+      <w:proofErr w:type="spellEnd"/>
+    </w:p>
+    <w:p>
+      <w:pPr>
+        <w:rPr>
+          <w:lang w:eastAsia="es-ES" w:bidi="ar-SA"/>
+        </w:rPr>
+      </w:pPr>
+      <w:r>
+        <w:rPr>
+          <w:lang w:eastAsia="es-ES" w:bidi="ar-SA"/>
+        </w:rPr>
+        <w:t xml:space="preserve">La proliferación de dispositivos </w:t>
+      </w:r>
+      <w:proofErr w:type="spellStart"/>
+      <w:r>
+        <w:rPr>
+          <w:lang w:eastAsia="es-ES" w:bidi="ar-SA"/>
+        </w:rPr>
+        <w:t>standalone</w:t>
+      </w:r>
+      <w:proofErr w:type="spellEnd"/>
+      <w:r>
+        <w:rPr>
+          <w:lang w:eastAsia="es-ES" w:bidi="ar-SA"/>
+        </w:rPr>
+        <w:t xml:space="preserve">, como la serie Meta </w:t>
+      </w:r>
+      <w:proofErr w:type="spellStart"/>
+      <w:r>
+        <w:rPr>
+          <w:lang w:eastAsia="es-ES" w:bidi="ar-SA"/>
+        </w:rPr>
+        <w:t>Quest</w:t>
+      </w:r>
+      <w:proofErr w:type="spellEnd"/>
+      <w:r>
+        <w:rPr>
+          <w:lang w:eastAsia="es-ES" w:bidi="ar-SA"/>
+        </w:rPr>
+        <w:t>, ha provocado</w:t>
+      </w:r>
+      <w:r>
+        <w:rPr>
+          <w:lang w:eastAsia="es-ES" w:bidi="ar-SA"/>
+        </w:rPr>
+        <w:t xml:space="preserve"> </w:t>
+      </w:r>
+      <w:r>
+        <w:rPr>
+          <w:lang w:eastAsia="es-ES" w:bidi="ar-SA"/>
+        </w:rPr>
+        <w:t>una expansión masiva de este mercado. Estos dispositivos permiten experiencias inmersivas</w:t>
+      </w:r>
+      <w:r>
+        <w:rPr>
+          <w:lang w:eastAsia="es-ES" w:bidi="ar-SA"/>
+        </w:rPr>
+        <w:t xml:space="preserve"> </w:t>
+      </w:r>
+      <w:r>
+        <w:rPr>
+          <w:lang w:eastAsia="es-ES" w:bidi="ar-SA"/>
+        </w:rPr>
+        <w:t>sin necesidad de estar conectados a una PC de alto rendimiento, reduciendo barreras</w:t>
+      </w:r>
+      <w:r>
+        <w:rPr>
+          <w:lang w:eastAsia="es-ES" w:bidi="ar-SA"/>
+        </w:rPr>
+        <w:t xml:space="preserve"> </w:t>
+      </w:r>
+      <w:r>
+        <w:rPr>
+          <w:lang w:eastAsia="es-ES" w:bidi="ar-SA"/>
+        </w:rPr>
+        <w:t xml:space="preserve">como el costo y la complejidad técnica [40][42][43][44]. Los HDM </w:t>
+      </w:r>
+      <w:proofErr w:type="spellStart"/>
+      <w:r>
+        <w:rPr>
+          <w:lang w:eastAsia="es-ES" w:bidi="ar-SA"/>
+        </w:rPr>
+        <w:t>standalone</w:t>
+      </w:r>
+      <w:proofErr w:type="spellEnd"/>
+      <w:r>
+        <w:rPr>
+          <w:lang w:eastAsia="es-ES" w:bidi="ar-SA"/>
+        </w:rPr>
+        <w:t xml:space="preserve"> están</w:t>
+      </w:r>
+      <w:r>
+        <w:rPr>
+          <w:lang w:eastAsia="es-ES" w:bidi="ar-SA"/>
+        </w:rPr>
+        <w:t xml:space="preserve"> </w:t>
+      </w:r>
+      <w:r>
+        <w:rPr>
+          <w:lang w:eastAsia="es-ES" w:bidi="ar-SA"/>
+        </w:rPr>
+        <w:t>transformando el acceso a la Realidad Virtual, promoviendo la adopción a gran escala y</w:t>
+      </w:r>
+      <w:r>
+        <w:rPr>
+          <w:lang w:eastAsia="es-ES" w:bidi="ar-SA"/>
+        </w:rPr>
+        <w:t xml:space="preserve"> </w:t>
+      </w:r>
+      <w:r>
+        <w:rPr>
+          <w:lang w:eastAsia="es-ES" w:bidi="ar-SA"/>
+        </w:rPr>
+        <w:t>promoviendo la creación de sistemas leves, como el seguimiento por mano, que optimizan</w:t>
+      </w:r>
+      <w:r>
+        <w:rPr>
+          <w:lang w:eastAsia="es-ES" w:bidi="ar-SA"/>
+        </w:rPr>
+        <w:t xml:space="preserve"> </w:t>
+      </w:r>
+      <w:r>
+        <w:rPr>
+          <w:lang w:eastAsia="es-ES" w:bidi="ar-SA"/>
+        </w:rPr>
+        <w:t>la usabilidad y la experiencia del usuario [44]. Para añadir más peso a estos datos, se ha</w:t>
+      </w:r>
+      <w:r>
+        <w:rPr>
+          <w:lang w:eastAsia="es-ES" w:bidi="ar-SA"/>
+        </w:rPr>
+        <w:t xml:space="preserve"> </w:t>
+      </w:r>
+      <w:r>
+        <w:rPr>
+          <w:lang w:eastAsia="es-ES" w:bidi="ar-SA"/>
+        </w:rPr>
+        <w:t xml:space="preserve">visto, </w:t>
+      </w:r>
+      <w:r>
+        <w:rPr>
+          <w:lang w:eastAsia="es-ES" w:bidi="ar-SA"/>
+        </w:rPr>
+        <w:t>mediante</w:t>
+      </w:r>
+      <w:r>
+        <w:rPr>
+          <w:lang w:eastAsia="es-ES" w:bidi="ar-SA"/>
+        </w:rPr>
+        <w:t xml:space="preserve"> las pruebas de experiencias en el metaverso con estos aparatos, que la</w:t>
+      </w:r>
+      <w:r>
+        <w:rPr>
+          <w:lang w:eastAsia="es-ES" w:bidi="ar-SA"/>
+        </w:rPr>
+        <w:t xml:space="preserve"> </w:t>
+      </w:r>
+      <w:r>
+        <w:rPr>
+          <w:lang w:eastAsia="es-ES" w:bidi="ar-SA"/>
+        </w:rPr>
+        <w:t>intención de uso futuro aumenta, pero que la intención de compra también depende de</w:t>
+      </w:r>
+      <w:r>
+        <w:rPr>
+          <w:lang w:eastAsia="es-ES" w:bidi="ar-SA"/>
+        </w:rPr>
+        <w:t xml:space="preserve"> </w:t>
+      </w:r>
+      <w:r>
+        <w:rPr>
+          <w:lang w:eastAsia="es-ES" w:bidi="ar-SA"/>
+        </w:rPr>
+        <w:t>otros elementos vinculados con la percepción de valor y la experiencia del usuario [43].</w:t>
+      </w:r>
+    </w:p>
+    <w:p>
+      <w:pPr>
+        <w:rPr>
+          <w:lang w:eastAsia="es-ES" w:bidi="ar-SA"/>
+        </w:rPr>
+      </w:pPr>
+    </w:p>
+    <w:p>
+      <w:pPr>
+        <w:pStyle w:val="Ttulo3"/>
+      </w:pPr>
+      <w:r>
+        <w:t>Factores adicionales y tendencias</w:t>
+      </w:r>
+    </w:p>
+    <w:p>
+      <w:pPr>
+        <w:pStyle w:val="Prrafodelista"/>
+        <w:numPr>
+          <w:ilvl w:val="0"/>
+          <w:numId w:val="7"/>
+        </w:numPr>
+        <w:rPr>
+          <w:lang w:eastAsia="es-ES" w:bidi="ar-SA"/>
+        </w:rPr>
+      </w:pPr>
+      <w:r>
+        <w:rPr>
+          <w:lang w:eastAsia="es-ES" w:bidi="ar-SA"/>
+        </w:rPr>
+        <w:t xml:space="preserve">La adopción de la Realidad Virtual se ve afectada por la tecnología y por </w:t>
+      </w:r>
+      <w:r>
+        <w:rPr>
+          <w:lang w:eastAsia="es-ES" w:bidi="ar-SA"/>
+        </w:rPr>
+        <w:t xml:space="preserve">elementos </w:t>
+      </w:r>
+      <w:r>
+        <w:rPr>
+          <w:lang w:eastAsia="es-ES" w:bidi="ar-SA"/>
+        </w:rPr>
+        <w:t>psicológicos y sociales de los usuarios, tales como su inclinación a la inmersión y su</w:t>
+      </w:r>
+      <w:r>
+        <w:rPr>
+          <w:lang w:eastAsia="es-ES" w:bidi="ar-SA"/>
+        </w:rPr>
+        <w:t xml:space="preserve"> </w:t>
+      </w:r>
+      <w:r>
+        <w:rPr>
+          <w:lang w:eastAsia="es-ES" w:bidi="ar-SA"/>
+        </w:rPr>
+        <w:t>percepción de éxito social. [42]</w:t>
+      </w:r>
+    </w:p>
+    <w:p>
+      <w:pPr>
+        <w:pStyle w:val="Prrafodelista"/>
+        <w:numPr>
+          <w:ilvl w:val="0"/>
+          <w:numId w:val="7"/>
+        </w:numPr>
+        <w:rPr>
+          <w:lang w:eastAsia="es-ES" w:bidi="ar-SA"/>
+        </w:rPr>
+      </w:pPr>
+      <w:r>
+        <w:rPr>
+          <w:lang w:eastAsia="es-ES" w:bidi="ar-SA"/>
+        </w:rPr>
+        <w:t>La calidad grá</w:t>
+      </w:r>
+      <w:r>
+        <w:rPr>
+          <w:lang w:eastAsia="es-ES" w:bidi="ar-SA"/>
+        </w:rPr>
+        <w:t>fi</w:t>
+      </w:r>
+      <w:r>
+        <w:rPr>
+          <w:lang w:eastAsia="es-ES" w:bidi="ar-SA"/>
+        </w:rPr>
+        <w:t>ca y la capacidad de procesamiento continúan siendo superiores en</w:t>
+      </w:r>
+      <w:r>
+        <w:rPr>
+          <w:lang w:eastAsia="es-ES" w:bidi="ar-SA"/>
+        </w:rPr>
+        <w:t xml:space="preserve"> </w:t>
+      </w:r>
+      <w:r>
+        <w:rPr>
+          <w:lang w:eastAsia="es-ES" w:bidi="ar-SA"/>
+        </w:rPr>
+        <w:t>sistemas vinculados a PC, sin embargo, los dispositivos independientes consiguen un</w:t>
+      </w:r>
+      <w:r>
+        <w:rPr>
+          <w:lang w:eastAsia="es-ES" w:bidi="ar-SA"/>
+        </w:rPr>
+        <w:t xml:space="preserve"> </w:t>
+      </w:r>
+      <w:r>
+        <w:rPr>
+          <w:lang w:eastAsia="es-ES" w:bidi="ar-SA"/>
+        </w:rPr>
+        <w:t xml:space="preserve">rendimiento y experiencia aceptables a </w:t>
+      </w:r>
+      <w:r>
+        <w:rPr>
+          <w:lang w:eastAsia="es-ES" w:bidi="ar-SA"/>
+        </w:rPr>
+        <w:lastRenderedPageBreak/>
+        <w:t>través de optimizaciones, sin comprometer</w:t>
+      </w:r>
+      <w:r>
+        <w:rPr>
+          <w:lang w:eastAsia="es-ES" w:bidi="ar-SA"/>
+        </w:rPr>
+        <w:t xml:space="preserve"> </w:t>
+      </w:r>
+      <w:r>
+        <w:rPr>
+          <w:lang w:eastAsia="es-ES" w:bidi="ar-SA"/>
+        </w:rPr>
+        <w:t>la exactitud del seguimiento ni la facilidad de uso. [44]</w:t>
+      </w:r>
+    </w:p>
+    <w:p>
+      <w:pPr>
+        <w:pStyle w:val="Prrafodelista"/>
+        <w:numPr>
+          <w:ilvl w:val="0"/>
+          <w:numId w:val="7"/>
+        </w:numPr>
+        <w:rPr>
+          <w:lang w:eastAsia="es-ES" w:bidi="ar-SA"/>
+        </w:rPr>
+      </w:pPr>
+      <w:r>
+        <w:rPr>
+          <w:lang w:eastAsia="es-ES" w:bidi="ar-SA"/>
+        </w:rPr>
+        <w:t>Compañías de varios sectores, tales como la educación, la industria automotriz y la</w:t>
+      </w:r>
+      <w:r>
+        <w:rPr>
+          <w:lang w:eastAsia="es-ES" w:bidi="ar-SA"/>
+        </w:rPr>
+        <w:t xml:space="preserve"> </w:t>
+      </w:r>
+      <w:r>
+        <w:rPr>
+          <w:lang w:eastAsia="es-ES" w:bidi="ar-SA"/>
+        </w:rPr>
+        <w:t>salud, están investigando aplicaciones de Realidad Virtual más allá del entretenimiento,</w:t>
+      </w:r>
+      <w:r>
+        <w:rPr>
+          <w:lang w:eastAsia="es-ES" w:bidi="ar-SA"/>
+        </w:rPr>
+        <w:t xml:space="preserve"> </w:t>
+      </w:r>
+      <w:r>
+        <w:rPr>
+          <w:lang w:eastAsia="es-ES" w:bidi="ar-SA"/>
+        </w:rPr>
+        <w:t>lo que incrementa la cobertura y el potencial del mercado. [40] [41]</w:t>
+      </w:r>
+    </w:p>
+    <w:p>
+      <w:pPr>
+        <w:rPr>
+          <w:lang w:eastAsia="es-ES" w:bidi="ar-SA"/>
+        </w:rPr>
+      </w:pPr>
+    </w:p>
+    <w:p>
+      <w:pPr>
+        <w:rPr>
+          <w:lang w:eastAsia="es-ES" w:bidi="ar-SA"/>
+        </w:rPr>
+      </w:pPr>
+      <w:r>
+        <w:rPr>
+          <w:lang w:eastAsia="es-ES" w:bidi="ar-SA"/>
+        </w:rPr>
+        <w:t>En resumen, el mercado de VR está en una fase de crecimiento acelerado, impulsado</w:t>
+      </w:r>
+    </w:p>
+    <w:p>
+      <w:pPr>
+        <w:rPr>
+          <w:lang w:eastAsia="es-ES" w:bidi="ar-SA"/>
+        </w:rPr>
+      </w:pPr>
+      <w:r>
+        <w:rPr>
+          <w:lang w:eastAsia="es-ES" w:bidi="ar-SA"/>
+        </w:rPr>
+        <w:t xml:space="preserve">por la universalización de dispositivos </w:t>
+      </w:r>
+      <w:proofErr w:type="spellStart"/>
+      <w:r>
+        <w:rPr>
+          <w:lang w:eastAsia="es-ES" w:bidi="ar-SA"/>
+        </w:rPr>
+        <w:t>standalone</w:t>
+      </w:r>
+      <w:proofErr w:type="spellEnd"/>
+      <w:r>
+        <w:rPr>
+          <w:lang w:eastAsia="es-ES" w:bidi="ar-SA"/>
+        </w:rPr>
+        <w:t xml:space="preserve"> y la diversi</w:t>
+      </w:r>
+      <w:r>
+        <w:rPr>
+          <w:lang w:eastAsia="es-ES" w:bidi="ar-SA"/>
+        </w:rPr>
+        <w:t>fi</w:t>
+      </w:r>
+      <w:r>
+        <w:rPr>
+          <w:lang w:eastAsia="es-ES" w:bidi="ar-SA"/>
+        </w:rPr>
+        <w:t>cación de aplicaciones, con</w:t>
+      </w:r>
+    </w:p>
+    <w:p>
+      <w:pPr>
+        <w:rPr>
+          <w:lang w:eastAsia="es-ES" w:bidi="ar-SA"/>
+        </w:rPr>
+      </w:pPr>
+      <w:r>
+        <w:rPr>
+          <w:lang w:eastAsia="es-ES" w:bidi="ar-SA"/>
+        </w:rPr>
+        <w:t>una proyección de expansión signi</w:t>
+      </w:r>
+      <w:r>
+        <w:rPr>
+          <w:lang w:eastAsia="es-ES" w:bidi="ar-SA"/>
+        </w:rPr>
+        <w:t>fi</w:t>
+      </w:r>
+      <w:r>
+        <w:rPr>
+          <w:lang w:eastAsia="es-ES" w:bidi="ar-SA"/>
+        </w:rPr>
+        <w:t>cativa para 2025 y 2026. [40][43][44]</w:t>
+      </w:r>
+    </w:p>
+    <w:p>
+      <w:pPr>
+        <w:rPr>
+          <w:lang w:eastAsia="es-ES" w:bidi="ar-SA"/>
+        </w:rPr>
+      </w:pPr>
+    </w:p>
+    <w:p>
+      <w:pPr>
+        <w:pStyle w:val="Ttulo2"/>
+      </w:pPr>
+      <w:r>
+        <w:t>2.7.2. Estándares emergentes en VR</w:t>
+      </w:r>
+    </w:p>
+    <w:p>
+      <w:pPr>
+        <w:pStyle w:val="Ttulo3"/>
+      </w:pPr>
+      <w:proofErr w:type="spellStart"/>
+      <w:r>
+        <w:t>OpenXR</w:t>
+      </w:r>
+      <w:proofErr w:type="spellEnd"/>
+    </w:p>
+    <w:p>
+      <w:pPr>
+        <w:rPr>
+          <w:lang w:eastAsia="es-ES" w:bidi="ar-SA"/>
+        </w:rPr>
+      </w:pPr>
+      <w:r>
+        <w:rPr>
+          <w:lang w:eastAsia="es-ES" w:bidi="ar-SA"/>
+        </w:rPr>
+        <w:t>Como ha pasado en muchos productos tecnológicos antes, uno de los principales desafíos históricos en el desarrollo de aplicaciones VR y AR ha sido la fragmentación de</w:t>
+      </w:r>
+      <w:r>
+        <w:rPr>
+          <w:lang w:eastAsia="es-ES" w:bidi="ar-SA"/>
+        </w:rPr>
+        <w:t xml:space="preserve"> </w:t>
+      </w:r>
+      <w:r>
+        <w:rPr>
+          <w:lang w:eastAsia="es-ES" w:bidi="ar-SA"/>
+        </w:rPr>
+        <w:t xml:space="preserve">dispositivos y plataformas. Cada fabricante implementaba sus propias </w:t>
+      </w:r>
+      <w:proofErr w:type="spellStart"/>
+      <w:r>
+        <w:rPr>
+          <w:lang w:eastAsia="es-ES" w:bidi="ar-SA"/>
+        </w:rPr>
+        <w:t>APIs</w:t>
+      </w:r>
+      <w:proofErr w:type="spellEnd"/>
+      <w:r>
+        <w:rPr>
+          <w:lang w:eastAsia="es-ES" w:bidi="ar-SA"/>
+        </w:rPr>
+        <w:t xml:space="preserve"> y </w:t>
+      </w:r>
+      <w:proofErr w:type="spellStart"/>
+      <w:r>
+        <w:rPr>
+          <w:lang w:eastAsia="es-ES" w:bidi="ar-SA"/>
+        </w:rPr>
+        <w:t>SDKs</w:t>
+      </w:r>
+      <w:proofErr w:type="spellEnd"/>
+      <w:r>
+        <w:rPr>
+          <w:lang w:eastAsia="es-ES" w:bidi="ar-SA"/>
+        </w:rPr>
+        <w:t>, lo</w:t>
+      </w:r>
+      <w:r>
+        <w:rPr>
+          <w:lang w:eastAsia="es-ES" w:bidi="ar-SA"/>
+        </w:rPr>
+        <w:t xml:space="preserve"> </w:t>
+      </w:r>
+      <w:r>
+        <w:rPr>
+          <w:lang w:eastAsia="es-ES" w:bidi="ar-SA"/>
+        </w:rPr>
+        <w:t>que conllevaba hacer muchas versiones de un mismo proyecto para funcionar en cada servicio.</w:t>
+      </w:r>
+    </w:p>
+    <w:p>
+      <w:pPr>
+        <w:rPr>
+          <w:lang w:eastAsia="es-ES" w:bidi="ar-SA"/>
+        </w:rPr>
+      </w:pPr>
+    </w:p>
+    <w:p>
+      <w:pPr>
+        <w:rPr>
+          <w:lang w:eastAsia="es-ES" w:bidi="ar-SA"/>
+        </w:rPr>
+      </w:pPr>
+      <w:r>
+        <w:rPr>
+          <w:lang w:eastAsia="es-ES" w:bidi="ar-SA"/>
+        </w:rPr>
+        <w:t xml:space="preserve">Para solucionar esto, el grupo Khronos </w:t>
+      </w:r>
+      <w:r>
+        <w:rPr>
+          <w:lang w:eastAsia="es-ES" w:bidi="ar-SA"/>
+        </w:rPr>
+        <w:t>--</w:t>
+      </w:r>
+      <w:r>
+        <w:rPr>
+          <w:lang w:eastAsia="es-ES" w:bidi="ar-SA"/>
+        </w:rPr>
+        <w:t>organización responsable de estándares como</w:t>
+      </w:r>
+      <w:r>
+        <w:rPr>
+          <w:lang w:eastAsia="es-ES" w:bidi="ar-SA"/>
+        </w:rPr>
+        <w:t xml:space="preserve"> </w:t>
+      </w:r>
+      <w:proofErr w:type="spellStart"/>
+      <w:r>
+        <w:rPr>
+          <w:lang w:eastAsia="es-ES" w:bidi="ar-SA"/>
+        </w:rPr>
+        <w:t>Vulkan</w:t>
+      </w:r>
+      <w:proofErr w:type="spellEnd"/>
+      <w:r>
+        <w:rPr>
+          <w:lang w:eastAsia="es-ES" w:bidi="ar-SA"/>
+        </w:rPr>
+        <w:t xml:space="preserve"> y OpenGL</w:t>
+      </w:r>
+      <w:r>
+        <w:rPr>
+          <w:lang w:eastAsia="es-ES" w:bidi="ar-SA"/>
+        </w:rPr>
+        <w:t>--</w:t>
+      </w:r>
+      <w:r>
+        <w:rPr>
+          <w:lang w:eastAsia="es-ES" w:bidi="ar-SA"/>
+        </w:rPr>
+        <w:t xml:space="preserve"> lanzó en 2019 </w:t>
+      </w:r>
+      <w:proofErr w:type="spellStart"/>
+      <w:r>
+        <w:rPr>
+          <w:lang w:eastAsia="es-ES" w:bidi="ar-SA"/>
+        </w:rPr>
+        <w:t>OpenXR</w:t>
+      </w:r>
+      <w:proofErr w:type="spellEnd"/>
+      <w:r>
+        <w:rPr>
+          <w:lang w:eastAsia="es-ES" w:bidi="ar-SA"/>
+        </w:rPr>
+        <w:t>, abierta y gratuita, para uni</w:t>
+      </w:r>
+      <w:r>
+        <w:rPr>
+          <w:lang w:eastAsia="es-ES" w:bidi="ar-SA"/>
+        </w:rPr>
+        <w:t>fi</w:t>
+      </w:r>
+      <w:r>
+        <w:rPr>
+          <w:lang w:eastAsia="es-ES" w:bidi="ar-SA"/>
+        </w:rPr>
+        <w:t>car el desarrollo</w:t>
+      </w:r>
+      <w:r>
+        <w:rPr>
+          <w:lang w:eastAsia="es-ES" w:bidi="ar-SA"/>
+        </w:rPr>
+        <w:t xml:space="preserve"> </w:t>
+      </w:r>
+      <w:r>
+        <w:rPr>
+          <w:lang w:eastAsia="es-ES" w:bidi="ar-SA"/>
+        </w:rPr>
+        <w:t>XR y no tener que hacer tantas versiones, una sola valdría para todo. Actualmente,</w:t>
+      </w:r>
+      <w:r>
+        <w:rPr>
+          <w:lang w:eastAsia="es-ES" w:bidi="ar-SA"/>
+        </w:rPr>
+        <w:t xml:space="preserve"> </w:t>
+      </w:r>
+      <w:r>
+        <w:rPr>
+          <w:lang w:eastAsia="es-ES" w:bidi="ar-SA"/>
+        </w:rPr>
+        <w:t xml:space="preserve">la </w:t>
+      </w:r>
+      <w:proofErr w:type="spellStart"/>
+      <w:r>
+        <w:rPr>
+          <w:lang w:eastAsia="es-ES" w:bidi="ar-SA"/>
+        </w:rPr>
+        <w:t>mayoria</w:t>
+      </w:r>
+      <w:proofErr w:type="spellEnd"/>
+      <w:r>
+        <w:rPr>
+          <w:lang w:eastAsia="es-ES" w:bidi="ar-SA"/>
+        </w:rPr>
+        <w:t xml:space="preserve"> de gigantes del ecosistema XR, como Unity, </w:t>
+      </w:r>
+      <w:proofErr w:type="spellStart"/>
+      <w:r>
+        <w:rPr>
+          <w:lang w:eastAsia="es-ES" w:bidi="ar-SA"/>
+        </w:rPr>
+        <w:t>Unreal</w:t>
+      </w:r>
+      <w:proofErr w:type="spellEnd"/>
+      <w:r>
+        <w:rPr>
+          <w:lang w:eastAsia="es-ES" w:bidi="ar-SA"/>
+        </w:rPr>
+        <w:t xml:space="preserve">, Godot, </w:t>
+      </w:r>
+      <w:proofErr w:type="spellStart"/>
+      <w:r>
+        <w:rPr>
+          <w:lang w:eastAsia="es-ES" w:bidi="ar-SA"/>
+        </w:rPr>
+        <w:t>Blender</w:t>
+      </w:r>
+      <w:proofErr w:type="spellEnd"/>
+      <w:r>
+        <w:rPr>
+          <w:lang w:eastAsia="es-ES" w:bidi="ar-SA"/>
+        </w:rPr>
+        <w:t>, Valve,</w:t>
+      </w:r>
+      <w:r>
+        <w:rPr>
+          <w:lang w:eastAsia="es-ES" w:bidi="ar-SA"/>
+        </w:rPr>
+        <w:t xml:space="preserve"> </w:t>
+      </w:r>
+      <w:r>
+        <w:rPr>
+          <w:lang w:eastAsia="es-ES" w:bidi="ar-SA"/>
+        </w:rPr>
+        <w:t>Microsoft y muchos otros, ya han adaptado este estándar internamente. [45]</w:t>
+      </w:r>
+    </w:p>
+    <w:p>
+      <w:pPr>
+        <w:rPr>
+          <w:lang w:eastAsia="es-ES" w:bidi="ar-SA"/>
+        </w:rPr>
+      </w:pPr>
+    </w:p>
+    <w:p>
+      <w:pPr>
+        <w:rPr>
+          <w:lang w:eastAsia="es-ES" w:bidi="ar-SA"/>
+        </w:rPr>
+      </w:pPr>
+      <w:r>
+        <w:rPr>
+          <w:lang w:eastAsia="es-ES" w:bidi="ar-SA"/>
+        </w:rPr>
+        <w:t xml:space="preserve">Además, al incorporar características de tecnologías avanzadas como </w:t>
+      </w:r>
+      <w:proofErr w:type="spellStart"/>
+      <w:r>
+        <w:rPr>
+          <w:lang w:eastAsia="es-ES" w:bidi="ar-SA"/>
+        </w:rPr>
+        <w:t>hand</w:t>
+      </w:r>
+      <w:proofErr w:type="spellEnd"/>
+      <w:r>
+        <w:rPr>
+          <w:lang w:eastAsia="es-ES" w:bidi="ar-SA"/>
+        </w:rPr>
+        <w:t xml:space="preserve"> tracking,</w:t>
+      </w:r>
+      <w:r>
+        <w:rPr>
+          <w:lang w:eastAsia="es-ES" w:bidi="ar-SA"/>
+        </w:rPr>
+        <w:t xml:space="preserve"> </w:t>
+      </w:r>
+      <w:r>
+        <w:rPr>
+          <w:lang w:eastAsia="es-ES" w:bidi="ar-SA"/>
+        </w:rPr>
+        <w:t xml:space="preserve">renderizado </w:t>
+      </w:r>
+      <w:proofErr w:type="spellStart"/>
+      <w:r>
+        <w:rPr>
+          <w:lang w:eastAsia="es-ES" w:bidi="ar-SA"/>
+        </w:rPr>
+        <w:t>multivista</w:t>
+      </w:r>
+      <w:proofErr w:type="spellEnd"/>
+      <w:r>
+        <w:rPr>
+          <w:lang w:eastAsia="es-ES" w:bidi="ar-SA"/>
+        </w:rPr>
+        <w:t>, input dinámico, y espacios anclados, su utilización se convierte en</w:t>
+      </w:r>
+      <w:r>
+        <w:rPr>
+          <w:lang w:eastAsia="es-ES" w:bidi="ar-SA"/>
+        </w:rPr>
+        <w:t xml:space="preserve"> </w:t>
+      </w:r>
+      <w:r>
+        <w:rPr>
+          <w:lang w:eastAsia="es-ES" w:bidi="ar-SA"/>
+        </w:rPr>
+        <w:t xml:space="preserve">una elección estratégica, incluso para desarrolladores de </w:t>
+      </w:r>
+      <w:proofErr w:type="spellStart"/>
+      <w:r>
+        <w:rPr>
+          <w:lang w:eastAsia="es-ES" w:bidi="ar-SA"/>
+        </w:rPr>
+        <w:t>Assets</w:t>
+      </w:r>
+      <w:proofErr w:type="spellEnd"/>
+      <w:r>
+        <w:rPr>
+          <w:lang w:eastAsia="es-ES" w:bidi="ar-SA"/>
+        </w:rPr>
+        <w:t xml:space="preserve"> como este teclado multilingüe, ya que su compatibilidad asegura que el recurso pueda ser empleado de manera</w:t>
+      </w:r>
+      <w:r>
+        <w:rPr>
+          <w:lang w:eastAsia="es-ES" w:bidi="ar-SA"/>
+        </w:rPr>
+        <w:t xml:space="preserve"> </w:t>
+      </w:r>
+      <w:r>
+        <w:rPr>
+          <w:lang w:eastAsia="es-ES" w:bidi="ar-SA"/>
+        </w:rPr>
+        <w:t>sencilla en visores actuales y venideros, sin la necesidad de recon</w:t>
+      </w:r>
+      <w:r>
+        <w:rPr>
+          <w:lang w:eastAsia="es-ES" w:bidi="ar-SA"/>
+        </w:rPr>
+        <w:t>fi</w:t>
+      </w:r>
+      <w:r>
+        <w:rPr>
+          <w:lang w:eastAsia="es-ES" w:bidi="ar-SA"/>
+        </w:rPr>
+        <w:t>gurar controladores o</w:t>
+      </w:r>
+      <w:r>
+        <w:rPr>
+          <w:lang w:eastAsia="es-ES" w:bidi="ar-SA"/>
+        </w:rPr>
+        <w:t xml:space="preserve"> </w:t>
+      </w:r>
+      <w:r>
+        <w:rPr>
+          <w:lang w:eastAsia="es-ES" w:bidi="ar-SA"/>
+        </w:rPr>
+        <w:t>ajustes particulares. [45]</w:t>
+      </w:r>
+    </w:p>
+    <w:p>
+      <w:pPr>
+        <w:rPr>
+          <w:lang w:eastAsia="es-ES" w:bidi="ar-SA"/>
+        </w:rPr>
+      </w:pPr>
+    </w:p>
+    <w:p>
+      <w:pPr>
+        <w:rPr>
+          <w:lang w:eastAsia="es-ES" w:bidi="ar-SA"/>
+        </w:rPr>
+      </w:pPr>
+      <w:r>
+        <w:rPr>
+          <w:lang w:eastAsia="es-ES" w:bidi="ar-SA"/>
+        </w:rPr>
+        <w:t xml:space="preserve">Desde una perspectiva académica, la normalización sugerida por </w:t>
+      </w:r>
+      <w:proofErr w:type="spellStart"/>
+      <w:r>
+        <w:rPr>
+          <w:lang w:eastAsia="es-ES" w:bidi="ar-SA"/>
+        </w:rPr>
+        <w:t>OpenXR</w:t>
+      </w:r>
+      <w:proofErr w:type="spellEnd"/>
+      <w:r>
+        <w:rPr>
+          <w:lang w:eastAsia="es-ES" w:bidi="ar-SA"/>
+        </w:rPr>
+        <w:t xml:space="preserve"> ha sido</w:t>
+      </w:r>
+      <w:r>
+        <w:rPr>
+          <w:lang w:eastAsia="es-ES" w:bidi="ar-SA"/>
+        </w:rPr>
+        <w:t xml:space="preserve"> </w:t>
+      </w:r>
+      <w:r>
+        <w:rPr>
+          <w:lang w:eastAsia="es-ES" w:bidi="ar-SA"/>
+        </w:rPr>
+        <w:t>vista como el elemento esencial para el desarrollo del metaverso y las experiencias XR</w:t>
+      </w:r>
+      <w:r>
+        <w:rPr>
+          <w:lang w:eastAsia="es-ES" w:bidi="ar-SA"/>
+        </w:rPr>
+        <w:t xml:space="preserve"> </w:t>
+      </w:r>
+      <w:proofErr w:type="spellStart"/>
+      <w:r>
+        <w:rPr>
+          <w:lang w:eastAsia="es-ES" w:bidi="ar-SA"/>
+        </w:rPr>
+        <w:t>interoperantes</w:t>
+      </w:r>
+      <w:proofErr w:type="spellEnd"/>
+      <w:r>
+        <w:rPr>
+          <w:lang w:eastAsia="es-ES" w:bidi="ar-SA"/>
+        </w:rPr>
+        <w:t>. [46]</w:t>
+      </w:r>
+    </w:p>
+    <w:p>
+      <w:pPr>
+        <w:pStyle w:val="Ttulo3"/>
+      </w:pPr>
+      <w:r>
+        <w:t>Tendencia hacia experiencias sin controladores (</w:t>
+      </w:r>
+      <w:r>
+        <w:t>“</w:t>
+      </w:r>
+      <w:proofErr w:type="spellStart"/>
+      <w:r>
+        <w:t>controller</w:t>
+      </w:r>
+      <w:proofErr w:type="spellEnd"/>
+      <w:r>
+        <w:t>-free</w:t>
+      </w:r>
+      <w:r>
+        <w:t>”</w:t>
+      </w:r>
+      <w:r>
+        <w:t>)</w:t>
+      </w:r>
+    </w:p>
+    <w:p>
+      <w:pPr>
+        <w:rPr>
+          <w:lang w:eastAsia="es-ES" w:bidi="ar-SA"/>
+        </w:rPr>
+      </w:pPr>
+      <w:r>
+        <w:rPr>
+          <w:lang w:eastAsia="es-ES" w:bidi="ar-SA"/>
+        </w:rPr>
+        <w:t xml:space="preserve">Otra tendencia tecnológica del VR es el abandono de los mandos físicos en </w:t>
+      </w:r>
+      <w:proofErr w:type="spellStart"/>
+      <w:r>
+        <w:rPr>
+          <w:lang w:eastAsia="es-ES" w:bidi="ar-SA"/>
+        </w:rPr>
+        <w:t>pos</w:t>
+      </w:r>
+      <w:proofErr w:type="spellEnd"/>
+      <w:r>
+        <w:rPr>
+          <w:lang w:eastAsia="es-ES" w:bidi="ar-SA"/>
+        </w:rPr>
+        <w:t xml:space="preserve"> de</w:t>
+      </w:r>
+      <w:r>
+        <w:rPr>
+          <w:lang w:eastAsia="es-ES" w:bidi="ar-SA"/>
+        </w:rPr>
+        <w:t xml:space="preserve"> </w:t>
+      </w:r>
+      <w:r>
+        <w:rPr>
+          <w:lang w:eastAsia="es-ES" w:bidi="ar-SA"/>
+        </w:rPr>
+        <w:t xml:space="preserve">experiencias </w:t>
+      </w:r>
+      <w:r>
+        <w:rPr>
+          <w:lang w:eastAsia="es-ES" w:bidi="ar-SA"/>
+        </w:rPr>
+        <w:t>“</w:t>
+      </w:r>
+      <w:proofErr w:type="spellStart"/>
+      <w:r>
+        <w:rPr>
+          <w:lang w:eastAsia="es-ES" w:bidi="ar-SA"/>
+        </w:rPr>
+        <w:t>c</w:t>
+      </w:r>
+      <w:r>
+        <w:rPr>
+          <w:lang w:eastAsia="es-ES" w:bidi="ar-SA"/>
+        </w:rPr>
+        <w:t>ontroller</w:t>
+      </w:r>
+      <w:proofErr w:type="spellEnd"/>
+      <w:r>
+        <w:rPr>
+          <w:lang w:eastAsia="es-ES" w:bidi="ar-SA"/>
+        </w:rPr>
+        <w:t xml:space="preserve">-free". El mayor exponente de este apartado tecnología es la tecnología de </w:t>
+      </w:r>
+      <w:proofErr w:type="spellStart"/>
+      <w:r>
+        <w:rPr>
+          <w:lang w:eastAsia="es-ES" w:bidi="ar-SA"/>
+        </w:rPr>
+        <w:t>hand</w:t>
+      </w:r>
+      <w:proofErr w:type="spellEnd"/>
+      <w:r>
+        <w:rPr>
+          <w:lang w:eastAsia="es-ES" w:bidi="ar-SA"/>
+        </w:rPr>
+        <w:t xml:space="preserve"> tracking, explicada anteriormente en el punto 2.5.2 y cuyas ventajas para</w:t>
+      </w:r>
+      <w:r>
+        <w:rPr>
+          <w:lang w:eastAsia="es-ES" w:bidi="ar-SA"/>
+        </w:rPr>
+        <w:t xml:space="preserve"> </w:t>
+      </w:r>
+      <w:r>
+        <w:rPr>
+          <w:lang w:eastAsia="es-ES" w:bidi="ar-SA"/>
+        </w:rPr>
+        <w:t>este proyecto también se han mostrado en el punto 2.5.4.</w:t>
+      </w:r>
+    </w:p>
+    <w:p>
+      <w:pPr>
+        <w:rPr>
+          <w:lang w:eastAsia="es-ES" w:bidi="ar-SA"/>
+        </w:rPr>
+      </w:pPr>
+    </w:p>
+    <w:p>
+      <w:pPr>
+        <w:rPr>
+          <w:lang w:eastAsia="es-ES" w:bidi="ar-SA"/>
+        </w:rPr>
+      </w:pPr>
+      <w:r>
+        <w:rPr>
+          <w:lang w:eastAsia="es-ES" w:bidi="ar-SA"/>
+        </w:rPr>
+        <w:t>Para aportar más información respecto a este tema y relacionándolo al punto anterior,</w:t>
+      </w:r>
+      <w:r>
+        <w:rPr>
+          <w:lang w:eastAsia="es-ES" w:bidi="ar-SA"/>
+        </w:rPr>
+        <w:t xml:space="preserve"> </w:t>
+      </w:r>
+      <w:r>
+        <w:rPr>
+          <w:lang w:eastAsia="es-ES" w:bidi="ar-SA"/>
+        </w:rPr>
+        <w:t>cabe destacar que gracias a cámaras integradas y modelos de IA, los visores modernos</w:t>
+      </w:r>
+      <w:r>
+        <w:rPr>
+          <w:lang w:eastAsia="es-ES" w:bidi="ar-SA"/>
+        </w:rPr>
+        <w:t xml:space="preserve"> </w:t>
+      </w:r>
+      <w:r>
+        <w:rPr>
+          <w:lang w:eastAsia="es-ES" w:bidi="ar-SA"/>
+        </w:rPr>
+        <w:t xml:space="preserve">(como las Meta </w:t>
+      </w:r>
+      <w:proofErr w:type="spellStart"/>
+      <w:r>
+        <w:rPr>
+          <w:lang w:eastAsia="es-ES" w:bidi="ar-SA"/>
+        </w:rPr>
+        <w:t>Quest</w:t>
+      </w:r>
+      <w:proofErr w:type="spellEnd"/>
+      <w:r>
+        <w:rPr>
+          <w:lang w:eastAsia="es-ES" w:bidi="ar-SA"/>
+        </w:rPr>
+        <w:t xml:space="preserve"> 2 y </w:t>
+      </w:r>
+      <w:proofErr w:type="spellStart"/>
+      <w:r>
+        <w:rPr>
+          <w:lang w:eastAsia="es-ES" w:bidi="ar-SA"/>
+        </w:rPr>
+        <w:t>Quest</w:t>
+      </w:r>
+      <w:proofErr w:type="spellEnd"/>
+      <w:r>
+        <w:rPr>
+          <w:lang w:eastAsia="es-ES" w:bidi="ar-SA"/>
+        </w:rPr>
+        <w:t xml:space="preserve"> 3) pueden detectar el movimiento de las manos del</w:t>
+      </w:r>
+      <w:r>
+        <w:rPr>
+          <w:lang w:eastAsia="es-ES" w:bidi="ar-SA"/>
+        </w:rPr>
+        <w:t xml:space="preserve"> </w:t>
+      </w:r>
+      <w:r>
+        <w:rPr>
+          <w:lang w:eastAsia="es-ES" w:bidi="ar-SA"/>
+        </w:rPr>
+        <w:t>usuario en tiempo real, reconociendo gestos como pulsaciones, agarres o desplazamientos.</w:t>
+      </w:r>
+    </w:p>
+    <w:p>
+      <w:pPr>
+        <w:rPr>
+          <w:lang w:eastAsia="es-ES" w:bidi="ar-SA"/>
+        </w:rPr>
+      </w:pPr>
+    </w:p>
+    <w:p>
+      <w:pPr>
+        <w:pStyle w:val="Ttulo1"/>
+        <w:numPr>
+          <w:ilvl w:val="0"/>
+          <w:numId w:val="0"/>
+        </w:numPr>
+      </w:pPr>
+      <w:r>
+        <w:t>2.8. Selección y justi</w:t>
+      </w:r>
+      <w:r>
+        <w:t>fi</w:t>
+      </w:r>
+      <w:r>
+        <w:t>cación de idiomas implementados</w:t>
+      </w:r>
+    </w:p>
+    <w:p>
+      <w:pPr>
+        <w:pStyle w:val="Ttulo2"/>
+      </w:pPr>
+      <w:r>
+        <w:t>2.8.1. Criterios de selección</w:t>
+      </w:r>
+    </w:p>
+    <w:p>
+      <w:pPr>
+        <w:rPr>
+          <w:lang w:eastAsia="es-ES" w:bidi="ar-SA"/>
+        </w:rPr>
+      </w:pPr>
+      <w:r>
+        <w:rPr>
+          <w:lang w:eastAsia="es-ES" w:bidi="ar-SA"/>
+        </w:rPr>
+        <w:t xml:space="preserve">Varios factores han sido considerados al elegir los idiomas empleados en este </w:t>
+      </w:r>
+      <w:proofErr w:type="spellStart"/>
+      <w:r>
+        <w:rPr>
+          <w:lang w:eastAsia="es-ES" w:bidi="ar-SA"/>
+        </w:rPr>
+        <w:t>Asset</w:t>
+      </w:r>
+      <w:proofErr w:type="spellEnd"/>
+      <w:r>
+        <w:rPr>
+          <w:lang w:eastAsia="es-ES" w:bidi="ar-SA"/>
+        </w:rPr>
+        <w:t>:</w:t>
+      </w:r>
+    </w:p>
+    <w:p>
+      <w:pPr>
+        <w:pStyle w:val="Prrafodelista"/>
+        <w:numPr>
+          <w:ilvl w:val="0"/>
+          <w:numId w:val="8"/>
+        </w:numPr>
+        <w:rPr>
+          <w:lang w:eastAsia="es-ES" w:bidi="ar-SA"/>
+        </w:rPr>
+      </w:pPr>
+      <w:r>
+        <w:rPr>
+          <w:lang w:eastAsia="es-ES" w:bidi="ar-SA"/>
+        </w:rPr>
+        <w:t>Representatividad geográ</w:t>
+      </w:r>
+      <w:r>
+        <w:rPr>
+          <w:lang w:eastAsia="es-ES" w:bidi="ar-SA"/>
+        </w:rPr>
+        <w:t>fi</w:t>
+      </w:r>
+      <w:r>
+        <w:rPr>
+          <w:lang w:eastAsia="es-ES" w:bidi="ar-SA"/>
+        </w:rPr>
+        <w:t>ca y demográ</w:t>
+      </w:r>
+      <w:r>
+        <w:rPr>
+          <w:lang w:eastAsia="es-ES" w:bidi="ar-SA"/>
+        </w:rPr>
+        <w:t>fi</w:t>
+      </w:r>
+      <w:r>
+        <w:rPr>
+          <w:lang w:eastAsia="es-ES" w:bidi="ar-SA"/>
+        </w:rPr>
+        <w:t>ca: con el objetivo de potenciar el impacto</w:t>
+      </w:r>
+      <w:r>
+        <w:rPr>
+          <w:lang w:eastAsia="es-ES" w:bidi="ar-SA"/>
+        </w:rPr>
+        <w:t xml:space="preserve"> </w:t>
+      </w:r>
+      <w:r>
+        <w:rPr>
+          <w:lang w:eastAsia="es-ES" w:bidi="ar-SA"/>
+        </w:rPr>
+        <w:t>en el mercado, se ha dado prioridad a la inclusión de idiomas con gran cantidad de</w:t>
+      </w:r>
+      <w:r>
+        <w:rPr>
+          <w:lang w:eastAsia="es-ES" w:bidi="ar-SA"/>
+        </w:rPr>
+        <w:t xml:space="preserve"> </w:t>
+      </w:r>
+      <w:r>
+        <w:rPr>
+          <w:lang w:eastAsia="es-ES" w:bidi="ar-SA"/>
+        </w:rPr>
+        <w:t xml:space="preserve">hablantes y a que abarquen la mayor parte del globo </w:t>
+      </w:r>
+      <w:r>
+        <w:rPr>
+          <w:lang w:eastAsia="es-ES" w:bidi="ar-SA"/>
+        </w:rPr>
+        <w:t>terráqueo</w:t>
+      </w:r>
+      <w:r>
+        <w:rPr>
+          <w:lang w:eastAsia="es-ES" w:bidi="ar-SA"/>
+        </w:rPr>
+        <w:t>.</w:t>
+      </w:r>
+    </w:p>
+    <w:p>
+      <w:pPr>
+        <w:pStyle w:val="Prrafodelista"/>
+        <w:numPr>
+          <w:ilvl w:val="0"/>
+          <w:numId w:val="8"/>
+        </w:numPr>
+        <w:rPr>
+          <w:lang w:eastAsia="es-ES" w:bidi="ar-SA"/>
+        </w:rPr>
+      </w:pPr>
+      <w:r>
+        <w:rPr>
+          <w:lang w:eastAsia="es-ES" w:bidi="ar-SA"/>
+        </w:rPr>
+        <w:t>Diversidad de sistemas de escritura: se han escogido lenguas que requieran diferentes</w:t>
+      </w:r>
+      <w:r>
+        <w:rPr>
+          <w:lang w:eastAsia="es-ES" w:bidi="ar-SA"/>
+        </w:rPr>
+        <w:t xml:space="preserve"> </w:t>
+      </w:r>
+      <w:r>
+        <w:rPr>
+          <w:lang w:eastAsia="es-ES" w:bidi="ar-SA"/>
+        </w:rPr>
+        <w:t>soluciones grá</w:t>
+      </w:r>
+      <w:r>
+        <w:rPr>
+          <w:lang w:eastAsia="es-ES" w:bidi="ar-SA"/>
+        </w:rPr>
+        <w:t>fi</w:t>
+      </w:r>
+      <w:r>
+        <w:rPr>
+          <w:lang w:eastAsia="es-ES" w:bidi="ar-SA"/>
+        </w:rPr>
+        <w:t>cas y funcionales, ya que uno de los propósitos del proyecto es</w:t>
+      </w:r>
+      <w:r>
+        <w:rPr>
+          <w:lang w:eastAsia="es-ES" w:bidi="ar-SA"/>
+        </w:rPr>
+        <w:t xml:space="preserve"> </w:t>
+      </w:r>
+      <w:r>
+        <w:rPr>
+          <w:lang w:eastAsia="es-ES" w:bidi="ar-SA"/>
+        </w:rPr>
+        <w:t>investigar la factibilidad de varios alfabetos (latino, árabe, silábico).</w:t>
+      </w:r>
+    </w:p>
+    <w:p>
+      <w:pPr>
+        <w:pStyle w:val="Prrafodelista"/>
+        <w:numPr>
+          <w:ilvl w:val="0"/>
+          <w:numId w:val="8"/>
+        </w:numPr>
+        <w:rPr>
+          <w:lang w:eastAsia="es-ES" w:bidi="ar-SA"/>
+        </w:rPr>
+      </w:pPr>
+      <w:r>
+        <w:rPr>
+          <w:lang w:eastAsia="es-ES" w:bidi="ar-SA"/>
+        </w:rPr>
+        <w:t>Viabilidad interpretativa: teniendo en consideración mi trayectoria estudiantil y mi</w:t>
+      </w:r>
+      <w:r>
+        <w:rPr>
+          <w:lang w:eastAsia="es-ES" w:bidi="ar-SA"/>
+        </w:rPr>
+        <w:t xml:space="preserve"> </w:t>
+      </w:r>
+      <w:r>
+        <w:rPr>
+          <w:lang w:eastAsia="es-ES" w:bidi="ar-SA"/>
+        </w:rPr>
+        <w:t>escasa capacidad lingüística, se ha dado prioridad a aquellos idiomas cuyo aprendizaje</w:t>
+      </w:r>
+      <w:r>
+        <w:rPr>
+          <w:lang w:eastAsia="es-ES" w:bidi="ar-SA"/>
+        </w:rPr>
+        <w:t xml:space="preserve"> </w:t>
+      </w:r>
+      <w:r>
+        <w:rPr>
+          <w:lang w:eastAsia="es-ES" w:bidi="ar-SA"/>
+        </w:rPr>
+        <w:t xml:space="preserve">de la </w:t>
+      </w:r>
+      <w:r>
+        <w:rPr>
+          <w:lang w:eastAsia="es-ES" w:bidi="ar-SA"/>
+        </w:rPr>
+        <w:t>teoría</w:t>
+      </w:r>
+      <w:r>
+        <w:rPr>
+          <w:lang w:eastAsia="es-ES" w:bidi="ar-SA"/>
+        </w:rPr>
+        <w:t xml:space="preserve"> de escritura entrara dentro del cronograma establecido.</w:t>
+      </w:r>
+    </w:p>
+    <w:p>
+      <w:pPr>
+        <w:pStyle w:val="Prrafodelista"/>
+        <w:numPr>
+          <w:ilvl w:val="0"/>
+          <w:numId w:val="8"/>
+        </w:numPr>
+        <w:rPr>
+          <w:lang w:eastAsia="es-ES" w:bidi="ar-SA"/>
+        </w:rPr>
+      </w:pPr>
+      <w:r>
+        <w:rPr>
+          <w:lang w:eastAsia="es-ES" w:bidi="ar-SA"/>
+        </w:rPr>
+        <w:t>Viabilidad técnica: la habilidad técnica individual y la herramienta empleada para el</w:t>
+      </w:r>
+      <w:r>
+        <w:rPr>
+          <w:lang w:eastAsia="es-ES" w:bidi="ar-SA"/>
+        </w:rPr>
+        <w:t xml:space="preserve"> </w:t>
+      </w:r>
+      <w:r>
+        <w:rPr>
+          <w:lang w:eastAsia="es-ES" w:bidi="ar-SA"/>
+        </w:rPr>
+        <w:t>desarrollo del teclado, han jugado un papel crucial en la eliminación o incorporación</w:t>
+      </w:r>
+      <w:r>
+        <w:rPr>
+          <w:lang w:eastAsia="es-ES" w:bidi="ar-SA"/>
+        </w:rPr>
+        <w:t xml:space="preserve"> </w:t>
+      </w:r>
+      <w:r>
+        <w:rPr>
+          <w:lang w:eastAsia="es-ES" w:bidi="ar-SA"/>
+        </w:rPr>
+        <w:t>de distintos idiomas.</w:t>
+      </w:r>
+    </w:p>
+    <w:p>
+      <w:pPr>
+        <w:pStyle w:val="Ttulo3"/>
+      </w:pPr>
+      <w:r>
+        <w:t>Aclaraciones especiales</w:t>
+      </w:r>
+    </w:p>
+    <w:p>
+      <w:pPr>
+        <w:rPr>
+          <w:lang w:eastAsia="es-ES" w:bidi="ar-SA"/>
+        </w:rPr>
+      </w:pPr>
+      <w:r>
+        <w:rPr>
+          <w:lang w:eastAsia="es-ES" w:bidi="ar-SA"/>
+        </w:rPr>
+        <w:t>En los siguientes apartados se detallarán todos y cada uno de los idiomas que alguna</w:t>
+      </w:r>
+      <w:r>
+        <w:rPr>
+          <w:lang w:eastAsia="es-ES" w:bidi="ar-SA"/>
+        </w:rPr>
+        <w:t xml:space="preserve"> </w:t>
+      </w:r>
+      <w:r>
+        <w:rPr>
+          <w:lang w:eastAsia="es-ES" w:bidi="ar-SA"/>
+        </w:rPr>
+        <w:t>vez se han planteado e incluso intentado en este proyecto.</w:t>
+      </w:r>
+    </w:p>
+    <w:p>
+      <w:pPr>
+        <w:rPr>
+          <w:lang w:eastAsia="es-ES" w:bidi="ar-SA"/>
+        </w:rPr>
+      </w:pPr>
+    </w:p>
+    <w:p>
+      <w:pPr>
+        <w:rPr>
+          <w:lang w:eastAsia="es-ES" w:bidi="ar-SA"/>
+        </w:rPr>
+      </w:pPr>
+      <w:r>
+        <w:rPr>
+          <w:lang w:eastAsia="es-ES" w:bidi="ar-SA"/>
+        </w:rPr>
+        <w:t xml:space="preserve">No se </w:t>
+      </w:r>
+      <w:r>
+        <w:rPr>
+          <w:lang w:eastAsia="es-ES" w:bidi="ar-SA"/>
+        </w:rPr>
+        <w:t>mencionará</w:t>
+      </w:r>
+      <w:r>
+        <w:rPr>
+          <w:lang w:eastAsia="es-ES" w:bidi="ar-SA"/>
+        </w:rPr>
+        <w:t xml:space="preserve"> ningún otro idioma que use el mismo teclado que los que se</w:t>
+      </w:r>
+    </w:p>
+    <w:p>
+      <w:pPr>
+        <w:rPr>
+          <w:lang w:eastAsia="es-ES" w:bidi="ar-SA"/>
+        </w:rPr>
+      </w:pPr>
+      <w:r>
+        <w:rPr>
+          <w:lang w:eastAsia="es-ES" w:bidi="ar-SA"/>
+        </w:rPr>
+        <w:t>van a nombrar, como por ejemplo el valenciano o catalán, pero esto no restringe su uso si</w:t>
+      </w:r>
+      <w:r>
+        <w:rPr>
+          <w:lang w:eastAsia="es-ES" w:bidi="ar-SA"/>
+        </w:rPr>
+        <w:t xml:space="preserve"> </w:t>
+      </w:r>
+      <w:r>
+        <w:rPr>
+          <w:lang w:eastAsia="es-ES" w:bidi="ar-SA"/>
+        </w:rPr>
+        <w:t>el idioma así pueda usarlo.</w:t>
+      </w:r>
+    </w:p>
+    <w:p>
+      <w:pPr>
+        <w:pStyle w:val="Ttulo2"/>
+      </w:pPr>
+      <w:r>
+        <w:t>2.8.2. Idiomas implementados</w:t>
+      </w:r>
+    </w:p>
+    <w:p>
+      <w:pPr>
+        <w:pStyle w:val="Prrafodelista"/>
+        <w:numPr>
+          <w:ilvl w:val="0"/>
+          <w:numId w:val="8"/>
+        </w:numPr>
+        <w:rPr>
+          <w:lang w:eastAsia="es-ES" w:bidi="ar-SA"/>
+        </w:rPr>
+      </w:pPr>
+      <w:r>
+        <w:rPr>
+          <w:lang w:eastAsia="es-ES" w:bidi="ar-SA"/>
+        </w:rPr>
+        <w:t xml:space="preserve">Español: lengua romance con </w:t>
+      </w:r>
+      <w:r>
+        <w:rPr>
+          <w:lang w:eastAsia="es-ES" w:bidi="ar-SA"/>
+        </w:rPr>
+        <w:t>más</w:t>
+      </w:r>
+      <w:r>
+        <w:rPr>
+          <w:lang w:eastAsia="es-ES" w:bidi="ar-SA"/>
+        </w:rPr>
+        <w:t xml:space="preserve"> de 500 millones de hablantes en el mundo y que</w:t>
+      </w:r>
+      <w:r>
+        <w:rPr>
+          <w:lang w:eastAsia="es-ES" w:bidi="ar-SA"/>
+        </w:rPr>
+        <w:t xml:space="preserve"> </w:t>
+      </w:r>
+      <w:r>
+        <w:rPr>
+          <w:lang w:eastAsia="es-ES" w:bidi="ar-SA"/>
+        </w:rPr>
+        <w:t>utiliza una variante del teclado QWERTY. Seleccionada por ser mi idioma materno</w:t>
+      </w:r>
+      <w:r>
+        <w:rPr>
+          <w:lang w:eastAsia="es-ES" w:bidi="ar-SA"/>
+        </w:rPr>
+        <w:t xml:space="preserve"> </w:t>
+      </w:r>
+      <w:r>
+        <w:rPr>
+          <w:lang w:eastAsia="es-ES" w:bidi="ar-SA"/>
+        </w:rPr>
+        <w:t>y por ello el que tenía mayor facilidad de implementación.</w:t>
+      </w:r>
+    </w:p>
+    <w:p>
+      <w:pPr>
+        <w:pStyle w:val="Prrafodelista"/>
+        <w:numPr>
+          <w:ilvl w:val="0"/>
+          <w:numId w:val="8"/>
+        </w:numPr>
+        <w:rPr>
+          <w:lang w:eastAsia="es-ES" w:bidi="ar-SA"/>
+        </w:rPr>
+      </w:pPr>
+      <w:r>
+        <w:rPr>
+          <w:lang w:eastAsia="es-ES" w:bidi="ar-SA"/>
+        </w:rPr>
+        <w:t xml:space="preserve">Inglés: Lengua anglosajona por </w:t>
+      </w:r>
+      <w:r>
+        <w:rPr>
+          <w:lang w:eastAsia="es-ES" w:bidi="ar-SA"/>
+        </w:rPr>
+        <w:t>antonomasia,</w:t>
+      </w:r>
+      <w:r>
+        <w:rPr>
+          <w:lang w:eastAsia="es-ES" w:bidi="ar-SA"/>
+        </w:rPr>
+        <w:t xml:space="preserve"> tiene el mayor uso en el ámbito</w:t>
+      </w:r>
+      <w:r>
+        <w:rPr>
+          <w:lang w:eastAsia="es-ES" w:bidi="ar-SA"/>
+        </w:rPr>
+        <w:t xml:space="preserve"> </w:t>
+      </w:r>
+      <w:r>
+        <w:rPr>
+          <w:lang w:eastAsia="es-ES" w:bidi="ar-SA"/>
+        </w:rPr>
+        <w:t>tecnológico de entre todas las lenguas en estas listas. Utiliza el teclado</w:t>
+      </w:r>
+      <w:r>
+        <w:rPr>
+          <w:lang w:eastAsia="es-ES" w:bidi="ar-SA"/>
+        </w:rPr>
+        <w:t xml:space="preserve"> </w:t>
+      </w:r>
+      <w:r>
+        <w:rPr>
+          <w:lang w:eastAsia="es-ES" w:bidi="ar-SA"/>
+        </w:rPr>
+        <w:t>QWERTY que hace de base de las demás variaciones.</w:t>
+      </w:r>
+    </w:p>
+    <w:p>
+      <w:pPr>
+        <w:pStyle w:val="Prrafodelista"/>
+        <w:numPr>
+          <w:ilvl w:val="0"/>
+          <w:numId w:val="8"/>
+        </w:numPr>
+        <w:rPr>
+          <w:lang w:eastAsia="es-ES" w:bidi="ar-SA"/>
+        </w:rPr>
+      </w:pPr>
+      <w:r>
+        <w:rPr>
+          <w:lang w:eastAsia="es-ES" w:bidi="ar-SA"/>
+        </w:rPr>
+        <w:lastRenderedPageBreak/>
+        <w:t>Francés: Incluido por su presencia en múltiples continentes y por representar una</w:t>
+      </w:r>
+      <w:r>
+        <w:rPr>
+          <w:lang w:eastAsia="es-ES" w:bidi="ar-SA"/>
+        </w:rPr>
+        <w:t xml:space="preserve"> </w:t>
+      </w:r>
+      <w:r>
+        <w:rPr>
+          <w:lang w:eastAsia="es-ES" w:bidi="ar-SA"/>
+        </w:rPr>
+        <w:t xml:space="preserve">variante del </w:t>
+      </w:r>
+      <w:proofErr w:type="spellStart"/>
+      <w:r>
+        <w:rPr>
+          <w:lang w:eastAsia="es-ES" w:bidi="ar-SA"/>
+        </w:rPr>
+        <w:t>layout</w:t>
+      </w:r>
+      <w:proofErr w:type="spellEnd"/>
+      <w:r>
+        <w:rPr>
+          <w:lang w:eastAsia="es-ES" w:bidi="ar-SA"/>
+        </w:rPr>
+        <w:t xml:space="preserve"> AZERTY, lo que implica desafíos especí</w:t>
+      </w:r>
+      <w:r>
+        <w:rPr>
+          <w:lang w:eastAsia="es-ES" w:bidi="ar-SA"/>
+        </w:rPr>
+        <w:t>fi</w:t>
+      </w:r>
+      <w:r>
+        <w:rPr>
+          <w:lang w:eastAsia="es-ES" w:bidi="ar-SA"/>
+        </w:rPr>
+        <w:t>cos en cuanto a disposición de teclas.</w:t>
+      </w:r>
+    </w:p>
+    <w:p>
+      <w:pPr>
+        <w:pStyle w:val="Prrafodelista"/>
+        <w:numPr>
+          <w:ilvl w:val="0"/>
+          <w:numId w:val="8"/>
+        </w:numPr>
+        <w:rPr>
+          <w:lang w:eastAsia="es-ES" w:bidi="ar-SA"/>
+        </w:rPr>
+      </w:pPr>
+      <w:r>
+        <w:rPr>
+          <w:lang w:eastAsia="es-ES" w:bidi="ar-SA"/>
+        </w:rPr>
+        <w:t xml:space="preserve">Alemán: Ejemplo del </w:t>
+      </w:r>
+      <w:proofErr w:type="spellStart"/>
+      <w:r>
+        <w:rPr>
+          <w:lang w:eastAsia="es-ES" w:bidi="ar-SA"/>
+        </w:rPr>
+        <w:t>layout</w:t>
+      </w:r>
+      <w:proofErr w:type="spellEnd"/>
+      <w:r>
+        <w:rPr>
+          <w:lang w:eastAsia="es-ES" w:bidi="ar-SA"/>
+        </w:rPr>
+        <w:t xml:space="preserve"> QWERTZ, con adaptaciones ortográ</w:t>
+      </w:r>
+      <w:r>
+        <w:rPr>
+          <w:lang w:eastAsia="es-ES" w:bidi="ar-SA"/>
+        </w:rPr>
+        <w:t>fi</w:t>
+      </w:r>
+      <w:r>
+        <w:rPr>
+          <w:lang w:eastAsia="es-ES" w:bidi="ar-SA"/>
+        </w:rPr>
+        <w:t xml:space="preserve">cas como la </w:t>
+      </w:r>
+      <w:r>
+        <w:rPr>
+          <w:lang w:eastAsia="es-ES" w:bidi="ar-SA"/>
+        </w:rPr>
+        <w:t>ß</w:t>
+      </w:r>
+      <w:r>
+        <w:rPr>
+          <w:lang w:eastAsia="es-ES" w:bidi="ar-SA"/>
+        </w:rPr>
+        <w:t xml:space="preserve"> y</w:t>
+      </w:r>
+      <w:r>
+        <w:rPr>
+          <w:lang w:eastAsia="es-ES" w:bidi="ar-SA"/>
+        </w:rPr>
+        <w:t xml:space="preserve"> </w:t>
+      </w:r>
+      <w:r>
+        <w:rPr>
+          <w:lang w:eastAsia="es-ES" w:bidi="ar-SA"/>
+        </w:rPr>
+        <w:t>umlauts, lo que aporta complejidad a nivel de interfaz.</w:t>
+      </w:r>
+    </w:p>
+    <w:p>
+      <w:pPr>
+        <w:pStyle w:val="Prrafodelista"/>
+        <w:numPr>
+          <w:ilvl w:val="0"/>
+          <w:numId w:val="8"/>
+        </w:numPr>
+        <w:rPr>
+          <w:lang w:eastAsia="es-ES" w:bidi="ar-SA"/>
+        </w:rPr>
+      </w:pPr>
+      <w:r>
+        <w:rPr>
+          <w:lang w:eastAsia="es-ES" w:bidi="ar-SA"/>
+        </w:rPr>
+        <w:t>Griego: Introduce un alfabeto completamente distinto al latino, lo que permite</w:t>
+      </w:r>
+      <w:r>
+        <w:rPr>
+          <w:lang w:eastAsia="es-ES" w:bidi="ar-SA"/>
+        </w:rPr>
+        <w:t xml:space="preserve"> </w:t>
+      </w:r>
+      <w:r>
+        <w:rPr>
+          <w:lang w:eastAsia="es-ES" w:bidi="ar-SA"/>
+        </w:rPr>
+        <w:t>validar la adaptación del teclado a otros sistemas fonológicos y grá</w:t>
+      </w:r>
+      <w:r>
+        <w:rPr>
+          <w:lang w:eastAsia="es-ES" w:bidi="ar-SA"/>
+        </w:rPr>
+        <w:t>fi</w:t>
+      </w:r>
+      <w:r>
+        <w:rPr>
+          <w:lang w:eastAsia="es-ES" w:bidi="ar-SA"/>
+        </w:rPr>
+        <w:t>cos.</w:t>
+      </w:r>
+    </w:p>
+    <w:p>
+      <w:pPr>
+        <w:pStyle w:val="Prrafodelista"/>
+        <w:numPr>
+          <w:ilvl w:val="0"/>
+          <w:numId w:val="8"/>
+        </w:numPr>
+        <w:rPr>
+          <w:lang w:eastAsia="es-ES" w:bidi="ar-SA"/>
+        </w:rPr>
+      </w:pPr>
+      <w:r>
+        <w:rPr>
+          <w:lang w:eastAsia="es-ES" w:bidi="ar-SA"/>
+        </w:rPr>
+        <w:t xml:space="preserve">Ruso: Sistema cirílico con el </w:t>
+      </w:r>
+      <w:proofErr w:type="spellStart"/>
+      <w:r>
+        <w:rPr>
+          <w:lang w:eastAsia="es-ES" w:bidi="ar-SA"/>
+        </w:rPr>
+        <w:t>layout</w:t>
+      </w:r>
+      <w:proofErr w:type="spellEnd"/>
+      <w:r>
+        <w:rPr>
+          <w:lang w:eastAsia="es-ES" w:bidi="ar-SA"/>
+        </w:rPr>
+        <w:t xml:space="preserve"> JCUKEN. Tiene fuerte presencia en Europa del</w:t>
+      </w:r>
+      <w:r>
+        <w:rPr>
+          <w:lang w:eastAsia="es-ES" w:bidi="ar-SA"/>
+        </w:rPr>
+        <w:t xml:space="preserve"> </w:t>
+      </w:r>
+      <w:r>
+        <w:rPr>
+          <w:lang w:eastAsia="es-ES" w:bidi="ar-SA"/>
+        </w:rPr>
+        <w:t>Este y Asia, útil para probar la adaptación a alfabetos de estructura densa y uso</w:t>
+      </w:r>
+      <w:r>
+        <w:rPr>
+          <w:lang w:eastAsia="es-ES" w:bidi="ar-SA"/>
+        </w:rPr>
+        <w:t xml:space="preserve"> </w:t>
+      </w:r>
+      <w:r>
+        <w:rPr>
+          <w:lang w:eastAsia="es-ES" w:bidi="ar-SA"/>
+        </w:rPr>
+        <w:t>frecuente de caracteres exclusivos.</w:t>
+      </w:r>
+    </w:p>
+    <w:p>
+      <w:pPr>
+        <w:pStyle w:val="Prrafodelista"/>
+        <w:numPr>
+          <w:ilvl w:val="0"/>
+          <w:numId w:val="8"/>
+        </w:numPr>
+        <w:rPr>
+          <w:lang w:eastAsia="es-ES" w:bidi="ar-SA"/>
+        </w:rPr>
+      </w:pPr>
+      <w:r>
+        <w:rPr>
+          <w:lang w:eastAsia="es-ES" w:bidi="ar-SA"/>
+        </w:rPr>
+        <w:t>Coreano: Su inclusión responde al interés por evaluar la capacidad del teclado</w:t>
+      </w:r>
+      <w:r>
+        <w:rPr>
+          <w:lang w:eastAsia="es-ES" w:bidi="ar-SA"/>
+        </w:rPr>
+        <w:t xml:space="preserve"> </w:t>
+      </w:r>
+      <w:r>
+        <w:rPr>
+          <w:lang w:eastAsia="es-ES" w:bidi="ar-SA"/>
+        </w:rPr>
+        <w:t xml:space="preserve">frente a sistemas de escritura silábicos y de construcción modular como el </w:t>
+      </w:r>
+      <w:proofErr w:type="spellStart"/>
+      <w:r>
+        <w:rPr>
+          <w:lang w:eastAsia="es-ES" w:bidi="ar-SA"/>
+        </w:rPr>
+        <w:t>Hangul</w:t>
+      </w:r>
+      <w:proofErr w:type="spellEnd"/>
+      <w:r>
+        <w:rPr>
+          <w:lang w:eastAsia="es-ES" w:bidi="ar-SA"/>
+        </w:rPr>
+        <w:t xml:space="preserve"> </w:t>
+      </w:r>
+      <w:r>
+        <w:rPr>
+          <w:lang w:eastAsia="es-ES" w:bidi="ar-SA"/>
+        </w:rPr>
+        <w:t>y además de ejercer de precedente de la incorporación de lenguas asiáticas.</w:t>
+      </w:r>
+    </w:p>
+    <w:p>
+      <w:pPr>
+        <w:pStyle w:val="Ttulo2"/>
+      </w:pPr>
+      <w:r>
+        <w:t>2.8.3. Idiomas descartados y motivos</w:t>
+      </w:r>
+    </w:p>
+    <w:p>
+      <w:pPr>
+        <w:pStyle w:val="Prrafodelista"/>
+        <w:numPr>
+          <w:ilvl w:val="0"/>
+          <w:numId w:val="8"/>
+        </w:numPr>
+        <w:rPr>
+          <w:lang w:eastAsia="es-ES" w:bidi="ar-SA"/>
+        </w:rPr>
+      </w:pPr>
+      <w:r>
+        <w:rPr>
+          <w:lang w:eastAsia="es-ES" w:bidi="ar-SA"/>
+        </w:rPr>
+        <w:t xml:space="preserve">Chino: Mayor exponente de los idiomas asiáticos </w:t>
+      </w:r>
+      <w:proofErr w:type="spellStart"/>
+      <w:r>
+        <w:rPr>
+          <w:lang w:eastAsia="es-ES" w:bidi="ar-SA"/>
+        </w:rPr>
+        <w:t>y</w:t>
+      </w:r>
+      <w:proofErr w:type="spellEnd"/>
+      <w:r>
+        <w:rPr>
+          <w:lang w:eastAsia="es-ES" w:bidi="ar-SA"/>
+        </w:rPr>
+        <w:t xml:space="preserve"> idioma con más hablantes nativos</w:t>
+      </w:r>
+      <w:r>
+        <w:rPr>
+          <w:lang w:eastAsia="es-ES" w:bidi="ar-SA"/>
+        </w:rPr>
+        <w:t xml:space="preserve"> </w:t>
+      </w:r>
+      <w:r>
+        <w:rPr>
+          <w:lang w:eastAsia="es-ES" w:bidi="ar-SA"/>
+        </w:rPr>
+        <w:t>del mundo, lo que lo convierte en una elección clara en el caso de querer extender</w:t>
+      </w:r>
+      <w:r>
+        <w:rPr>
+          <w:lang w:eastAsia="es-ES" w:bidi="ar-SA"/>
+        </w:rPr>
+        <w:t xml:space="preserve"> </w:t>
+      </w:r>
+      <w:r>
+        <w:rPr>
+          <w:lang w:eastAsia="es-ES" w:bidi="ar-SA"/>
+        </w:rPr>
+        <w:t xml:space="preserve">el posible mercado. Este idioma se investigó y se hicieron pruebas técnicas, no </w:t>
+      </w:r>
+      <w:r>
+        <w:rPr>
+          <w:lang w:eastAsia="es-ES" w:bidi="ar-SA"/>
+        </w:rPr>
+        <w:t>obstante,</w:t>
+      </w:r>
+      <w:r>
+        <w:rPr>
+          <w:lang w:eastAsia="es-ES" w:bidi="ar-SA"/>
+        </w:rPr>
+        <w:t xml:space="preserve"> </w:t>
+      </w:r>
+      <w:r>
+        <w:rPr>
+          <w:lang w:eastAsia="es-ES" w:bidi="ar-SA"/>
+        </w:rPr>
+        <w:t>al usar un teclado QWERTY para escribir en pinyin (sistema de escritura que</w:t>
+      </w:r>
+      <w:r>
+        <w:rPr>
+          <w:lang w:eastAsia="es-ES" w:bidi="ar-SA"/>
+        </w:rPr>
+        <w:t xml:space="preserve"> </w:t>
+      </w:r>
+      <w:r>
+        <w:rPr>
+          <w:lang w:eastAsia="es-ES" w:bidi="ar-SA"/>
+        </w:rPr>
+        <w:t>utiliza el alfabeto latino para escribir como se pronuncian las palabras), cosa que</w:t>
+      </w:r>
+      <w:r>
+        <w:rPr>
+          <w:lang w:eastAsia="es-ES" w:bidi="ar-SA"/>
+        </w:rPr>
+        <w:t xml:space="preserve"> </w:t>
+      </w:r>
+      <w:r>
+        <w:rPr>
+          <w:lang w:eastAsia="es-ES" w:bidi="ar-SA"/>
+        </w:rPr>
+        <w:t>luego se traduce a chino mandarín (dialecto más extendido del chino), aparecía el</w:t>
+      </w:r>
+      <w:r>
+        <w:rPr>
+          <w:lang w:eastAsia="es-ES" w:bidi="ar-SA"/>
+        </w:rPr>
+        <w:t xml:space="preserve"> </w:t>
+      </w:r>
+      <w:r>
+        <w:rPr>
+          <w:lang w:eastAsia="es-ES" w:bidi="ar-SA"/>
+        </w:rPr>
+        <w:t>gran problema de que Unity no permite, por el momento, el uso de librerías dedicadas</w:t>
+      </w:r>
+      <w:r>
+        <w:rPr>
+          <w:lang w:eastAsia="es-ES" w:bidi="ar-SA"/>
+        </w:rPr>
+        <w:t xml:space="preserve"> </w:t>
+      </w:r>
+      <w:r>
+        <w:rPr>
+          <w:lang w:eastAsia="es-ES" w:bidi="ar-SA"/>
+        </w:rPr>
+        <w:t>a este propósito, que ya existen en C# base. La solución pasaba por crear</w:t>
+      </w:r>
+      <w:r>
+        <w:rPr>
+          <w:lang w:eastAsia="es-ES" w:bidi="ar-SA"/>
+        </w:rPr>
+        <w:t xml:space="preserve"> </w:t>
+      </w:r>
+      <w:r>
+        <w:rPr>
+          <w:lang w:eastAsia="es-ES" w:bidi="ar-SA"/>
+        </w:rPr>
+        <w:t>manualmente un archivo o base de datos para poder realizar esta conversión, reto</w:t>
+      </w:r>
+      <w:r>
+        <w:rPr>
+          <w:lang w:eastAsia="es-ES" w:bidi="ar-SA"/>
+        </w:rPr>
+        <w:t xml:space="preserve"> </w:t>
+      </w:r>
+      <w:r>
+        <w:rPr>
+          <w:lang w:eastAsia="es-ES" w:bidi="ar-SA"/>
+        </w:rPr>
+        <w:t xml:space="preserve">que técnicamente no era complicado pero cuya extensión lo </w:t>
+      </w:r>
+      <w:r>
+        <w:rPr>
+          <w:lang w:eastAsia="es-ES" w:bidi="ar-SA"/>
+        </w:rPr>
+        <w:t>hacía</w:t>
+      </w:r>
+      <w:r>
+        <w:rPr>
+          <w:lang w:eastAsia="es-ES" w:bidi="ar-SA"/>
+        </w:rPr>
+        <w:t xml:space="preserve"> completamente</w:t>
+      </w:r>
+      <w:r>
+        <w:rPr>
+          <w:lang w:eastAsia="es-ES" w:bidi="ar-SA"/>
+        </w:rPr>
+        <w:t xml:space="preserve"> </w:t>
+      </w:r>
+      <w:r>
+        <w:rPr>
+          <w:lang w:eastAsia="es-ES" w:bidi="ar-SA"/>
+        </w:rPr>
+        <w:t>inviable. El chino es un idioma que cuenta con más de 500000 palabras, a esto hay</w:t>
+      </w:r>
+      <w:r>
+        <w:rPr>
+          <w:lang w:eastAsia="es-ES" w:bidi="ar-SA"/>
+        </w:rPr>
+        <w:t xml:space="preserve"> </w:t>
+      </w:r>
+      <w:r>
+        <w:rPr>
+          <w:lang w:eastAsia="es-ES" w:bidi="ar-SA"/>
+        </w:rPr>
+        <w:t>que sumar el hecho de que hay una gran cantidad de palabras que cuentan con la</w:t>
+      </w:r>
+      <w:r>
+        <w:rPr>
+          <w:lang w:eastAsia="es-ES" w:bidi="ar-SA"/>
+        </w:rPr>
+        <w:t xml:space="preserve"> </w:t>
+      </w:r>
+      <w:r>
+        <w:rPr>
+          <w:lang w:eastAsia="es-ES" w:bidi="ar-SA"/>
+        </w:rPr>
+        <w:t xml:space="preserve">misma fonología que otras, por lo </w:t>
+      </w:r>
+      <w:r>
+        <w:rPr>
+          <w:lang w:eastAsia="es-ES" w:bidi="ar-SA"/>
+        </w:rPr>
+        <w:t>que,</w:t>
+      </w:r>
+      <w:r>
+        <w:rPr>
+          <w:lang w:eastAsia="es-ES" w:bidi="ar-SA"/>
+        </w:rPr>
+        <w:t xml:space="preserve"> al escribir una palabra en pinyin, podían salir</w:t>
+      </w:r>
+      <w:r>
+        <w:rPr>
+          <w:lang w:eastAsia="es-ES" w:bidi="ar-SA"/>
+        </w:rPr>
+        <w:t xml:space="preserve"> </w:t>
+      </w:r>
+      <w:r>
+        <w:rPr>
+          <w:lang w:eastAsia="es-ES" w:bidi="ar-SA"/>
+        </w:rPr>
+        <w:t>hasta 11 coincidencias exactas a elegir.</w:t>
+      </w:r>
+    </w:p>
+    <w:p>
+      <w:pPr>
+        <w:pStyle w:val="Prrafodelista"/>
+        <w:numPr>
+          <w:ilvl w:val="0"/>
+          <w:numId w:val="8"/>
+        </w:numPr>
+        <w:rPr>
+          <w:lang w:eastAsia="es-ES" w:bidi="ar-SA"/>
+        </w:rPr>
+      </w:pPr>
+      <w:r>
+        <w:rPr>
+          <w:lang w:eastAsia="es-ES" w:bidi="ar-SA"/>
+        </w:rPr>
+        <w:t>Japonés: Idioma de las tierras niponas, que cuenta con tres tipos de escritura</w:t>
+      </w:r>
+      <w:r>
+        <w:rPr>
+          <w:lang w:eastAsia="es-ES" w:bidi="ar-SA"/>
+        </w:rPr>
+        <w:t xml:space="preserve"> </w:t>
+      </w:r>
+      <w:r>
+        <w:rPr>
+          <w:lang w:eastAsia="es-ES" w:bidi="ar-SA"/>
+        </w:rPr>
+        <w:t xml:space="preserve">distintas, el kanji, de origen chino, el </w:t>
+      </w:r>
+      <w:r>
+        <w:rPr>
+          <w:lang w:eastAsia="es-ES" w:bidi="ar-SA"/>
+        </w:rPr>
+        <w:t>katakana</w:t>
+      </w:r>
+      <w:r>
+        <w:rPr>
+          <w:lang w:eastAsia="es-ES" w:bidi="ar-SA"/>
+        </w:rPr>
+        <w:t>, silabario utilizado para representar</w:t>
+      </w:r>
+      <w:r>
+        <w:rPr>
+          <w:lang w:eastAsia="es-ES" w:bidi="ar-SA"/>
+        </w:rPr>
+        <w:t xml:space="preserve"> </w:t>
+      </w:r>
+      <w:r>
+        <w:rPr>
+          <w:lang w:eastAsia="es-ES" w:bidi="ar-SA"/>
+        </w:rPr>
+        <w:t>palabras que vienen de otro idioma y onomatopeyas, y el hiragana, silabario que se</w:t>
+      </w:r>
+      <w:r>
+        <w:rPr>
+          <w:lang w:eastAsia="es-ES" w:bidi="ar-SA"/>
+        </w:rPr>
+        <w:t xml:space="preserve"> </w:t>
+      </w:r>
+      <w:r>
+        <w:rPr>
+          <w:lang w:eastAsia="es-ES" w:bidi="ar-SA"/>
+        </w:rPr>
+        <w:t>emplea en la escritura de palabras japonesas, partículas y desinencias verbales. Tiene</w:t>
+      </w:r>
+      <w:r>
+        <w:rPr>
+          <w:lang w:eastAsia="es-ES" w:bidi="ar-SA"/>
+        </w:rPr>
+        <w:t xml:space="preserve"> </w:t>
+      </w:r>
+      <w:r>
+        <w:rPr>
+          <w:lang w:eastAsia="es-ES" w:bidi="ar-SA"/>
+        </w:rPr>
+        <w:t xml:space="preserve">un sistema </w:t>
+      </w:r>
+      <w:r>
+        <w:rPr>
+          <w:lang w:eastAsia="es-ES" w:bidi="ar-SA"/>
+        </w:rPr>
+        <w:t>homólogo</w:t>
+      </w:r>
+      <w:r>
+        <w:rPr>
+          <w:lang w:eastAsia="es-ES" w:bidi="ar-SA"/>
+        </w:rPr>
+        <w:t xml:space="preserve"> con el chino, también utiliza un teclado QWERTY </w:t>
+      </w:r>
+      <w:r>
+        <w:rPr>
+          <w:lang w:eastAsia="es-ES" w:bidi="ar-SA"/>
+        </w:rPr>
+        <w:t>estándar</w:t>
+      </w:r>
+      <w:r>
+        <w:rPr>
+          <w:lang w:eastAsia="es-ES" w:bidi="ar-SA"/>
+        </w:rPr>
+        <w:t xml:space="preserve"> en</w:t>
+      </w:r>
+      <w:r>
+        <w:rPr>
+          <w:lang w:eastAsia="es-ES" w:bidi="ar-SA"/>
+        </w:rPr>
+        <w:t xml:space="preserve"> </w:t>
+      </w:r>
+      <w:r>
+        <w:rPr>
+          <w:lang w:eastAsia="es-ES" w:bidi="ar-SA"/>
+        </w:rPr>
+        <w:t xml:space="preserve">el que se escribe </w:t>
+      </w:r>
+      <w:proofErr w:type="spellStart"/>
+      <w:r>
+        <w:rPr>
+          <w:lang w:eastAsia="es-ES" w:bidi="ar-SA"/>
+        </w:rPr>
+        <w:t>romanji</w:t>
+      </w:r>
+      <w:proofErr w:type="spellEnd"/>
+      <w:r>
+        <w:rPr>
+          <w:lang w:eastAsia="es-ES" w:bidi="ar-SA"/>
+        </w:rPr>
+        <w:t xml:space="preserve">, que es como el </w:t>
+      </w:r>
+      <w:r>
+        <w:rPr>
+          <w:lang w:eastAsia="es-ES" w:bidi="ar-SA"/>
+        </w:rPr>
+        <w:t>pinyin,</w:t>
+      </w:r>
+      <w:r>
+        <w:rPr>
+          <w:lang w:eastAsia="es-ES" w:bidi="ar-SA"/>
+        </w:rPr>
+        <w:t xml:space="preserve"> pero en este idioma, y se muestran</w:t>
+      </w:r>
+      <w:r>
+        <w:rPr>
+          <w:lang w:eastAsia="es-ES" w:bidi="ar-SA"/>
+        </w:rPr>
+        <w:t xml:space="preserve"> </w:t>
+      </w:r>
+      <w:r>
+        <w:rPr>
+          <w:lang w:eastAsia="es-ES" w:bidi="ar-SA"/>
+        </w:rPr>
+        <w:t xml:space="preserve">sus </w:t>
+      </w:r>
+      <w:r>
+        <w:rPr>
+          <w:lang w:eastAsia="es-ES" w:bidi="ar-SA"/>
+        </w:rPr>
+        <w:t>homónimos</w:t>
+      </w:r>
+      <w:r>
+        <w:rPr>
+          <w:lang w:eastAsia="es-ES" w:bidi="ar-SA"/>
+        </w:rPr>
+        <w:t xml:space="preserve"> en katakana, hiragana o kanji a elegir. Como con el chino, este idioma</w:t>
+      </w:r>
+      <w:r>
+        <w:rPr>
+          <w:lang w:eastAsia="es-ES" w:bidi="ar-SA"/>
+        </w:rPr>
+        <w:t xml:space="preserve"> </w:t>
+      </w:r>
+      <w:r>
+        <w:rPr>
+          <w:lang w:eastAsia="es-ES" w:bidi="ar-SA"/>
+        </w:rPr>
+        <w:t>se intentó y se descartó por el mismo motivo, la incapacidad de Unity de utilizar</w:t>
+      </w:r>
+      <w:r>
+        <w:rPr>
+          <w:lang w:eastAsia="es-ES" w:bidi="ar-SA"/>
+        </w:rPr>
+        <w:t xml:space="preserve"> </w:t>
+      </w:r>
+      <w:r>
+        <w:rPr>
+          <w:lang w:eastAsia="es-ES" w:bidi="ar-SA"/>
+        </w:rPr>
+        <w:t>librerías</w:t>
+      </w:r>
+      <w:r>
+        <w:rPr>
+          <w:lang w:eastAsia="es-ES" w:bidi="ar-SA"/>
+        </w:rPr>
+        <w:t xml:space="preserve"> que transformaran el </w:t>
+      </w:r>
+      <w:proofErr w:type="spellStart"/>
+      <w:r>
+        <w:rPr>
+          <w:lang w:eastAsia="es-ES" w:bidi="ar-SA"/>
+        </w:rPr>
+        <w:t>romanji</w:t>
+      </w:r>
+      <w:proofErr w:type="spellEnd"/>
+      <w:r>
+        <w:rPr>
+          <w:lang w:eastAsia="es-ES" w:bidi="ar-SA"/>
+        </w:rPr>
+        <w:t xml:space="preserve"> y el excesivo trabajo para crear la base de</w:t>
+      </w:r>
+      <w:r>
+        <w:rPr>
+          <w:lang w:eastAsia="es-ES" w:bidi="ar-SA"/>
+        </w:rPr>
+        <w:t xml:space="preserve"> </w:t>
+      </w:r>
+      <w:r>
+        <w:rPr>
+          <w:lang w:eastAsia="es-ES" w:bidi="ar-SA"/>
+        </w:rPr>
+        <w:t>datos.</w:t>
+      </w:r>
+    </w:p>
+    <w:p>
+      <w:pPr>
+        <w:pStyle w:val="Prrafodelista"/>
+        <w:numPr>
+          <w:ilvl w:val="0"/>
+          <w:numId w:val="8"/>
+        </w:numPr>
+        <w:rPr>
+          <w:lang w:eastAsia="es-ES" w:bidi="ar-SA"/>
+        </w:rPr>
+      </w:pPr>
+      <w:r>
+        <w:rPr>
+          <w:lang w:eastAsia="es-ES" w:bidi="ar-SA"/>
+        </w:rPr>
+        <w:t>Árabe: Este idioma presentaba el mayor aliciente económico en mi proyecto, ya que</w:t>
+      </w:r>
+      <w:r>
+        <w:rPr>
+          <w:lang w:eastAsia="es-ES" w:bidi="ar-SA"/>
+        </w:rPr>
+        <w:t xml:space="preserve"> </w:t>
+      </w:r>
+      <w:r>
+        <w:rPr>
+          <w:lang w:eastAsia="es-ES" w:bidi="ar-SA"/>
+        </w:rPr>
+        <w:t>fui</w:t>
+      </w:r>
+      <w:r>
+        <w:rPr>
+          <w:lang w:eastAsia="es-ES" w:bidi="ar-SA"/>
+        </w:rPr>
+        <w:t xml:space="preserve"> informado por parte de mi tutor de la alta demanda de software por parte de</w:t>
+      </w:r>
+      <w:r>
+        <w:rPr>
+          <w:lang w:eastAsia="es-ES" w:bidi="ar-SA"/>
+        </w:rPr>
+        <w:t xml:space="preserve"> </w:t>
+      </w:r>
+      <w:r>
+        <w:rPr>
+          <w:lang w:eastAsia="es-ES" w:bidi="ar-SA"/>
+        </w:rPr>
+        <w:t>hablantes de este idioma y cuya alternativa, cito textualmente "</w:t>
+      </w:r>
+      <w:r>
+        <w:rPr>
+          <w:lang w:eastAsia="es-ES" w:bidi="ar-SA"/>
+        </w:rPr>
+        <w:t>moría</w:t>
+      </w:r>
+      <w:r>
+        <w:rPr>
+          <w:lang w:eastAsia="es-ES" w:bidi="ar-SA"/>
+        </w:rPr>
+        <w:t xml:space="preserve"> en el inglés".</w:t>
+      </w:r>
+      <w:r>
+        <w:rPr>
+          <w:lang w:eastAsia="es-ES" w:bidi="ar-SA"/>
+        </w:rPr>
+        <w:t xml:space="preserve"> </w:t>
+      </w:r>
+      <w:r>
+        <w:rPr>
+          <w:lang w:eastAsia="es-ES" w:bidi="ar-SA"/>
+        </w:rPr>
+        <w:t>No obstante, la extremada complejidad técnica de intentar un idioma, que para</w:t>
+      </w:r>
+      <w:r>
+        <w:rPr>
+          <w:lang w:eastAsia="es-ES" w:bidi="ar-SA"/>
+        </w:rPr>
+        <w:t xml:space="preserve"> </w:t>
+      </w:r>
+      <w:r>
+        <w:rPr>
+          <w:lang w:eastAsia="es-ES" w:bidi="ar-SA"/>
+        </w:rPr>
+        <w:t xml:space="preserve">empezar se escribe de derecha a </w:t>
+      </w:r>
+      <w:r>
+        <w:rPr>
+          <w:lang w:eastAsia="es-ES" w:bidi="ar-SA"/>
+        </w:rPr>
+        <w:lastRenderedPageBreak/>
+        <w:t>izquierda, no existen vocales, que letras presentan</w:t>
+      </w:r>
+      <w:r>
+        <w:rPr>
+          <w:lang w:eastAsia="es-ES" w:bidi="ar-SA"/>
+        </w:rPr>
+        <w:t xml:space="preserve"> </w:t>
+      </w:r>
+      <w:r>
+        <w:rPr>
+          <w:lang w:eastAsia="es-ES" w:bidi="ar-SA"/>
+        </w:rPr>
+        <w:t xml:space="preserve">grandes cambios dependiendo de que la acompañe y </w:t>
+      </w:r>
+      <w:r>
+        <w:rPr>
+          <w:lang w:eastAsia="es-ES" w:bidi="ar-SA"/>
+        </w:rPr>
+        <w:t>fi</w:t>
+      </w:r>
+      <w:r>
+        <w:rPr>
+          <w:lang w:eastAsia="es-ES" w:bidi="ar-SA"/>
+        </w:rPr>
+        <w:t>nalizando al hecho de que</w:t>
+      </w:r>
+      <w:r>
+        <w:rPr>
+          <w:lang w:eastAsia="es-ES" w:bidi="ar-SA"/>
+        </w:rPr>
+        <w:t xml:space="preserve"> </w:t>
+      </w:r>
+      <w:r>
+        <w:rPr>
+          <w:lang w:eastAsia="es-ES" w:bidi="ar-SA"/>
+        </w:rPr>
+        <w:t>Unity no está nativamente preparado para estas características, supuso el descartamiento</w:t>
+      </w:r>
+      <w:r>
+        <w:rPr>
+          <w:lang w:eastAsia="es-ES" w:bidi="ar-SA"/>
+        </w:rPr>
+        <w:t xml:space="preserve"> </w:t>
+      </w:r>
+      <w:r>
+        <w:rPr>
+          <w:lang w:eastAsia="es-ES" w:bidi="ar-SA"/>
+        </w:rPr>
+        <w:t>fi</w:t>
+      </w:r>
+      <w:r>
+        <w:rPr>
+          <w:lang w:eastAsia="es-ES" w:bidi="ar-SA"/>
+        </w:rPr>
+        <w:t>nal de este muy a mi pesar.</w:t>
+      </w:r>
+    </w:p>
+    <w:p>
+      <w:pPr>
+        <w:rPr>
+          <w:lang w:eastAsia="es-ES" w:bidi="ar-SA"/>
+        </w:rPr>
+      </w:pPr>
+    </w:p>
+    <w:p>
+      <w:pPr>
+        <w:pStyle w:val="Ttulo2"/>
+      </w:pPr>
+      <w:r>
+        <w:t>2.8.4. Retos técnicos en la implementación</w:t>
+      </w:r>
+    </w:p>
+    <w:p>
+      <w:pPr>
+        <w:pStyle w:val="Prrafodelista"/>
+        <w:numPr>
+          <w:ilvl w:val="0"/>
+          <w:numId w:val="8"/>
+        </w:numPr>
+        <w:rPr>
+          <w:lang w:eastAsia="es-ES" w:bidi="ar-SA"/>
+        </w:rPr>
+      </w:pPr>
+      <w:r>
+        <w:rPr>
+          <w:lang w:eastAsia="es-ES" w:bidi="ar-SA"/>
+        </w:rPr>
+        <w:t>Soporte tipográ</w:t>
+      </w:r>
+      <w:r>
+        <w:rPr>
+          <w:lang w:eastAsia="es-ES" w:bidi="ar-SA"/>
+        </w:rPr>
+        <w:t>fi</w:t>
+      </w:r>
+      <w:r>
+        <w:rPr>
+          <w:lang w:eastAsia="es-ES" w:bidi="ar-SA"/>
+        </w:rPr>
+        <w:t>co y codi</w:t>
+      </w:r>
+      <w:r>
+        <w:rPr>
+          <w:lang w:eastAsia="es-ES" w:bidi="ar-SA"/>
+        </w:rPr>
+        <w:t>fi</w:t>
+      </w:r>
+      <w:r>
+        <w:rPr>
+          <w:lang w:eastAsia="es-ES" w:bidi="ar-SA"/>
+        </w:rPr>
+        <w:t>cación Unicode: Al contar diversos idiomas no</w:t>
+      </w:r>
+      <w:r>
+        <w:rPr>
+          <w:lang w:eastAsia="es-ES" w:bidi="ar-SA"/>
+        </w:rPr>
+        <w:t xml:space="preserve"> </w:t>
+      </w:r>
+      <w:r>
+        <w:rPr>
+          <w:lang w:eastAsia="es-ES" w:bidi="ar-SA"/>
+        </w:rPr>
+        <w:t>latinos como el ruso o el coreano, hubo que jugar con el uso de Unicode y adaptar</w:t>
+      </w:r>
+      <w:r>
+        <w:rPr>
+          <w:lang w:eastAsia="es-ES" w:bidi="ar-SA"/>
+        </w:rPr>
+        <w:t xml:space="preserve"> </w:t>
+      </w:r>
+      <w:r>
+        <w:rPr>
+          <w:lang w:eastAsia="es-ES" w:bidi="ar-SA"/>
+        </w:rPr>
+        <w:t xml:space="preserve">la salida del </w:t>
+      </w:r>
+      <w:proofErr w:type="spellStart"/>
+      <w:r>
+        <w:rPr>
+          <w:lang w:eastAsia="es-ES" w:bidi="ar-SA"/>
+        </w:rPr>
+        <w:t>TextMeshPro</w:t>
+      </w:r>
+      <w:proofErr w:type="spellEnd"/>
+      <w:r>
+        <w:rPr>
+          <w:lang w:eastAsia="es-ES" w:bidi="ar-SA"/>
+        </w:rPr>
+        <w:t xml:space="preserve"> para que se renderizaran correctamente los caracteres.</w:t>
+      </w:r>
+    </w:p>
+    <w:p>
+      <w:pPr>
+        <w:pStyle w:val="Prrafodelista"/>
+        <w:numPr>
+          <w:ilvl w:val="0"/>
+          <w:numId w:val="8"/>
+        </w:numPr>
+        <w:rPr>
+          <w:lang w:eastAsia="es-ES" w:bidi="ar-SA"/>
+        </w:rPr>
+      </w:pPr>
+      <w:r>
+        <w:rPr>
+          <w:lang w:eastAsia="es-ES" w:bidi="ar-SA"/>
+        </w:rPr>
+        <w:t xml:space="preserve">Diseño y disposición del teclado: Se han tenido que adaptar los </w:t>
+      </w:r>
+      <w:proofErr w:type="spellStart"/>
+      <w:r>
+        <w:rPr>
+          <w:lang w:eastAsia="es-ES" w:bidi="ar-SA"/>
+        </w:rPr>
+        <w:t>layouts</w:t>
+      </w:r>
+      <w:proofErr w:type="spellEnd"/>
+      <w:r>
+        <w:rPr>
+          <w:lang w:eastAsia="es-ES" w:bidi="ar-SA"/>
+        </w:rPr>
+        <w:t xml:space="preserve"> de cada</w:t>
+      </w:r>
+      <w:r>
+        <w:rPr>
+          <w:lang w:eastAsia="es-ES" w:bidi="ar-SA"/>
+        </w:rPr>
+        <w:t xml:space="preserve"> </w:t>
+      </w:r>
+      <w:r>
+        <w:rPr>
+          <w:lang w:eastAsia="es-ES" w:bidi="ar-SA"/>
+        </w:rPr>
+        <w:t>teclado, camb</w:t>
+      </w:r>
+      <w:r>
+        <w:rPr>
+          <w:lang w:eastAsia="es-ES" w:bidi="ar-SA"/>
+        </w:rPr>
+        <w:t>ia</w:t>
+      </w:r>
+      <w:r>
+        <w:rPr>
+          <w:lang w:eastAsia="es-ES" w:bidi="ar-SA"/>
+        </w:rPr>
+        <w:t xml:space="preserve">ndo la posición y </w:t>
+      </w:r>
+      <w:proofErr w:type="spellStart"/>
+      <w:r>
+        <w:rPr>
+          <w:lang w:eastAsia="es-ES" w:bidi="ar-SA"/>
+        </w:rPr>
+        <w:t>cantiad</w:t>
+      </w:r>
+      <w:proofErr w:type="spellEnd"/>
+      <w:r>
+        <w:rPr>
+          <w:lang w:eastAsia="es-ES" w:bidi="ar-SA"/>
+        </w:rPr>
+        <w:t xml:space="preserve"> de teclas, a su idioma correspondiente.</w:t>
+      </w:r>
+    </w:p>
+    <w:p>
+      <w:pPr>
+        <w:pStyle w:val="Prrafodelista"/>
+        <w:numPr>
+          <w:ilvl w:val="0"/>
+          <w:numId w:val="8"/>
+        </w:numPr>
+        <w:rPr>
+          <w:lang w:eastAsia="es-ES" w:bidi="ar-SA"/>
+        </w:rPr>
+      </w:pPr>
+      <w:r>
+        <w:rPr>
+          <w:lang w:eastAsia="es-ES" w:bidi="ar-SA"/>
+        </w:rPr>
+        <w:t xml:space="preserve">Reconocimiento de entradas con </w:t>
+      </w:r>
+      <w:proofErr w:type="spellStart"/>
+      <w:r>
+        <w:rPr>
+          <w:lang w:eastAsia="es-ES" w:bidi="ar-SA"/>
+        </w:rPr>
+        <w:t>hand</w:t>
+      </w:r>
+      <w:proofErr w:type="spellEnd"/>
+      <w:r>
+        <w:rPr>
+          <w:lang w:eastAsia="es-ES" w:bidi="ar-SA"/>
+        </w:rPr>
+        <w:t xml:space="preserve"> tracking: </w:t>
+      </w:r>
+      <w:r>
+        <w:rPr>
+          <w:lang w:eastAsia="es-ES" w:bidi="ar-SA"/>
+        </w:rPr>
+        <w:t xml:space="preserve">Al utilizar esta tecnología, </w:t>
+      </w:r>
+      <w:proofErr w:type="spellStart"/>
+      <w:r>
+        <w:rPr>
+          <w:lang w:eastAsia="es-ES" w:bidi="ar-SA"/>
+        </w:rPr>
+        <w:t>fué</w:t>
+      </w:r>
+      <w:proofErr w:type="spellEnd"/>
+      <w:r>
+        <w:rPr>
+          <w:lang w:eastAsia="es-ES" w:bidi="ar-SA"/>
+        </w:rPr>
+        <w:t xml:space="preserve"> necesario el trabajo de la correcta identificación de los toques para mantener la precisión.</w:t>
+      </w:r>
+      <w:r>
+        <w:rPr>
+          <w:rFonts w:ascii="Open Sans" w:hAnsi="Open Sans" w:cs="Open Sans"/>
+          <w:color w:val="172B4D"/>
+          <w:szCs w:val="24"/>
+          <w:shd w:val="clear" w:color="auto" w:fill="FFFFFF"/>
+        </w:rPr>
+        <w:t xml:space="preserve"> </w:t>
+      </w:r>
+    </w:p>
+    <w:p>
+      <w:pPr>
+        <w:pStyle w:val="Prrafodelista"/>
+        <w:numPr>
+          <w:ilvl w:val="0"/>
+          <w:numId w:val="8"/>
+        </w:numPr>
+        <w:rPr>
+          <w:lang w:eastAsia="es-ES" w:bidi="ar-SA"/>
+        </w:rPr>
+      </w:pPr>
+      <w:r>
+        <w:rPr>
+          <w:lang w:eastAsia="es-ES" w:bidi="ar-SA"/>
+        </w:rPr>
+        <w:t xml:space="preserve"> Gestión del ajuste del idioma y del tipo de teclado: Se ha desarrollado una interfaz que simplifica la transición de idiomas o de tipos de teclado, sin interferir con la experiencia del usuario ni dificultar su inmersión.</w:t>
+      </w:r>
+    </w:p>
+    <w:p>
+      <w:pPr>
+        <w:pStyle w:val="Prrafodelista"/>
+        <w:numPr>
+          <w:ilvl w:val="0"/>
+          <w:numId w:val="8"/>
+        </w:numPr>
+        <w:rPr>
+          <w:lang w:eastAsia="es-ES" w:bidi="ar-SA"/>
+        </w:rPr>
+      </w:pPr>
+      <w:r>
+        <w:rPr>
+          <w:lang w:eastAsia="es-ES" w:bidi="ar-SA"/>
+        </w:rPr>
+        <w:t xml:space="preserve">Desarrollo de sílabas en el </w:t>
+      </w:r>
+      <w:proofErr w:type="spellStart"/>
+      <w:r>
+        <w:rPr>
+          <w:lang w:eastAsia="es-ES" w:bidi="ar-SA"/>
+        </w:rPr>
+        <w:t>Hangul</w:t>
+      </w:r>
+      <w:proofErr w:type="spellEnd"/>
+      <w:r>
+        <w:rPr>
+          <w:lang w:eastAsia="es-ES" w:bidi="ar-SA"/>
+        </w:rPr>
+        <w:t>: Dado que el coreano funciona con sílabas en vez de palabras, se ha requerido la implementación de un algoritmo que automatiza la transformación de las sílabas durante la escritura.</w:t>
       </w:r>
     </w:p>
     <w:sectPr>
@@ -5417,6 +9017,119 @@
     </w:lvl>
   </w:abstractNum>
   <w:abstractNum w:abstractNumId="1" w15:restartNumberingAfterBreak="0">
+    <w:nsid w:val="13F542FD"/>
+    <w:multiLevelType w:val="hybridMultilevel"/>
+    <w:tmpl w:val="7632F542"/>
+    <w:lvl w:ilvl="0" w:tplc="0C0A0001">
+      <w:start w:val="1"/>
+      <w:numFmt w:val="bullet"/>
+      <w:lvlText w:val=""/>
+      <w:lvlJc w:val="left"/>
+      <w:pPr>
+        <w:ind w:left="720" w:hanging="360"/>
+      </w:pPr>
+      <w:rPr>
+        <w:rFonts w:ascii="Symbol" w:hAnsi="Symbol" w:hint="default"/>
+      </w:rPr>
+    </w:lvl>
+    <w:lvl w:ilvl="1" w:tplc="0C0A0003" w:tentative="1">
+      <w:start w:val="1"/>
+      <w:numFmt w:val="bullet"/>
+      <w:lvlText w:val="o"/>
+      <w:lvlJc w:val="left"/>
+      <w:pPr>
+        <w:ind w:left="1440" w:hanging="360"/>
+      </w:pPr>
+      <w:rPr>
+        <w:rFonts w:ascii="Courier New" w:hAnsi="Courier New" w:cs="Courier New" w:hint="default"/>
+      </w:rPr>
+    </w:lvl>
+    <w:lvl w:ilvl="2" w:tplc="0C0A0005" w:tentative="1">
+      <w:start w:val="1"/>
+      <w:numFmt w:val="bullet"/>
+      <w:lvlText w:val=""/>
+      <w:lvlJc w:val="left"/>
+      <w:pPr>
+        <w:ind w:left="2160" w:hanging="360"/>
+      </w:pPr>
+      <w:rPr>
+        <w:rFonts w:ascii="Wingdings" w:hAnsi="Wingdings" w:hint="default"/>
+      </w:rPr>
+    </w:lvl>
+    <w:lvl w:ilvl="3" w:tplc="0C0A0001" w:tentative="1">
+      <w:start w:val="1"/>
+      <w:numFmt w:val="bullet"/>
+      <w:lvlText w:val=""/>
+      <w:lvlJc w:val="left"/>
+      <w:pPr>
+        <w:ind w:left="2880" w:hanging="360"/>
+      </w:pPr>
+      <w:rPr>
+        <w:rFonts w:ascii="Symbol" w:hAnsi="Symbol" w:hint="default"/>
+      </w:rPr>
+    </w:lvl>
+    <w:lvl w:ilvl="4" w:tplc="0C0A0003" w:tentative="1">
+      <w:start w:val="1"/>
+      <w:numFmt w:val="bullet"/>
+      <w:lvlText w:val="o"/>
+      <w:lvlJc w:val="left"/>
+      <w:pPr>
+        <w:ind w:left="3600" w:hanging="360"/>
+      </w:pPr>
+      <w:rPr>
+        <w:rFonts w:ascii="Courier New" w:hAnsi="Courier New" w:cs="Courier New" w:hint="default"/>
+      </w:rPr>
+    </w:lvl>
+    <w:lvl w:ilvl="5" w:tplc="0C0A0005" w:tentative="1">
+      <w:start w:val="1"/>
+      <w:numFmt w:val="bullet"/>
+      <w:lvlText w:val=""/>
+      <w:lvlJc w:val="left"/>
+      <w:pPr>
+        <w:ind w:left="4320" w:hanging="360"/>
+      </w:pPr>
+      <w:rPr>
+        <w:rFonts w:ascii="Wingdings" w:hAnsi="Wingdings" w:hint="default"/>
+      </w:rPr>
+    </w:lvl>
+    <w:lvl w:ilvl="6" w:tplc="0C0A0001" w:tentative="1">
+      <w:start w:val="1"/>
+      <w:numFmt w:val="bullet"/>
+      <w:lvlText w:val=""/>
+      <w:lvlJc w:val="left"/>
+      <w:pPr>
+        <w:ind w:left="5040" w:hanging="360"/>
+      </w:pPr>
+      <w:rPr>
+        <w:rFonts w:ascii="Symbol" w:hAnsi="Symbol" w:hint="default"/>
+      </w:rPr>
+    </w:lvl>
+    <w:lvl w:ilvl="7" w:tplc="0C0A0003" w:tentative="1">
+      <w:start w:val="1"/>
+      <w:numFmt w:val="bullet"/>
+      <w:lvlText w:val="o"/>
+      <w:lvlJc w:val="left"/>
+      <w:pPr>
+        <w:ind w:left="5760" w:hanging="360"/>
+      </w:pPr>
+      <w:rPr>
+        <w:rFonts w:ascii="Courier New" w:hAnsi="Courier New" w:cs="Courier New" w:hint="default"/>
+      </w:rPr>
+    </w:lvl>
+    <w:lvl w:ilvl="8" w:tplc="0C0A0005" w:tentative="1">
+      <w:start w:val="1"/>
+      <w:numFmt w:val="bullet"/>
+      <w:lvlText w:val=""/>
+      <w:lvlJc w:val="left"/>
+      <w:pPr>
+        <w:ind w:left="6480" w:hanging="360"/>
+      </w:pPr>
+      <w:rPr>
+        <w:rFonts w:ascii="Wingdings" w:hAnsi="Wingdings" w:hint="default"/>
+      </w:rPr>
+    </w:lvl>
+  </w:abstractNum>
+  <w:abstractNum w:abstractNumId="2" w15:restartNumberingAfterBreak="0">
     <w:nsid w:val="29060730"/>
     <w:multiLevelType w:val="multilevel"/>
     <w:tmpl w:val="D550F632"/>
@@ -5476,7 +9189,7 @@
       <w:lvlJc w:val="left"/>
     </w:lvl>
   </w:abstractNum>
-  <w:abstractNum w:abstractNumId="2" w15:restartNumberingAfterBreak="0">
+  <w:abstractNum w:abstractNumId="3" w15:restartNumberingAfterBreak="0">
     <w:nsid w:val="3EC1443A"/>
     <w:multiLevelType w:val="hybridMultilevel"/>
     <w:tmpl w:val="70140932"/>
@@ -5589,10 +9302,10 @@
       </w:rPr>
     </w:lvl>
   </w:abstractNum>
-  <w:abstractNum w:abstractNumId="3" w15:restartNumberingAfterBreak="0">
-    <w:nsid w:val="73683CFC"/>
+  <w:abstractNum w:abstractNumId="4" w15:restartNumberingAfterBreak="0">
+    <w:nsid w:val="72F207B2"/>
     <w:multiLevelType w:val="hybridMultilevel"/>
-    <w:tmpl w:val="BC8CEF7E"/>
+    <w:tmpl w:val="E6B8C8C0"/>
     <w:lvl w:ilvl="0" w:tplc="0C0A0001">
       <w:start w:val="1"/>
       <w:numFmt w:val="bullet"/>
@@ -5702,7 +9415,120 @@
       </w:rPr>
     </w:lvl>
   </w:abstractNum>
-  <w:abstractNum w:abstractNumId="4" w15:restartNumberingAfterBreak="0">
+  <w:abstractNum w:abstractNumId="5" w15:restartNumberingAfterBreak="0">
+    <w:nsid w:val="73683CFC"/>
+    <w:multiLevelType w:val="hybridMultilevel"/>
+    <w:tmpl w:val="BC8CEF7E"/>
+    <w:lvl w:ilvl="0" w:tplc="0C0A0001">
+      <w:start w:val="1"/>
+      <w:numFmt w:val="bullet"/>
+      <w:lvlText w:val=""/>
+      <w:lvlJc w:val="left"/>
+      <w:pPr>
+        <w:ind w:left="720" w:hanging="360"/>
+      </w:pPr>
+      <w:rPr>
+        <w:rFonts w:ascii="Symbol" w:hAnsi="Symbol" w:hint="default"/>
+      </w:rPr>
+    </w:lvl>
+    <w:lvl w:ilvl="1" w:tplc="0C0A0003" w:tentative="1">
+      <w:start w:val="1"/>
+      <w:numFmt w:val="bullet"/>
+      <w:lvlText w:val="o"/>
+      <w:lvlJc w:val="left"/>
+      <w:pPr>
+        <w:ind w:left="1440" w:hanging="360"/>
+      </w:pPr>
+      <w:rPr>
+        <w:rFonts w:ascii="Courier New" w:hAnsi="Courier New" w:cs="Courier New" w:hint="default"/>
+      </w:rPr>
+    </w:lvl>
+    <w:lvl w:ilvl="2" w:tplc="0C0A0005" w:tentative="1">
+      <w:start w:val="1"/>
+      <w:numFmt w:val="bullet"/>
+      <w:lvlText w:val=""/>
+      <w:lvlJc w:val="left"/>
+      <w:pPr>
+        <w:ind w:left="2160" w:hanging="360"/>
+      </w:pPr>
+      <w:rPr>
+        <w:rFonts w:ascii="Wingdings" w:hAnsi="Wingdings" w:hint="default"/>
+      </w:rPr>
+    </w:lvl>
+    <w:lvl w:ilvl="3" w:tplc="0C0A0001" w:tentative="1">
+      <w:start w:val="1"/>
+      <w:numFmt w:val="bullet"/>
+      <w:lvlText w:val=""/>
+      <w:lvlJc w:val="left"/>
+      <w:pPr>
+        <w:ind w:left="2880" w:hanging="360"/>
+      </w:pPr>
+      <w:rPr>
+        <w:rFonts w:ascii="Symbol" w:hAnsi="Symbol" w:hint="default"/>
+      </w:rPr>
+    </w:lvl>
+    <w:lvl w:ilvl="4" w:tplc="0C0A0003" w:tentative="1">
+      <w:start w:val="1"/>
+      <w:numFmt w:val="bullet"/>
+      <w:lvlText w:val="o"/>
+      <w:lvlJc w:val="left"/>
+      <w:pPr>
+        <w:ind w:left="3600" w:hanging="360"/>
+      </w:pPr>
+      <w:rPr>
+        <w:rFonts w:ascii="Courier New" w:hAnsi="Courier New" w:cs="Courier New" w:hint="default"/>
+      </w:rPr>
+    </w:lvl>
+    <w:lvl w:ilvl="5" w:tplc="0C0A0005" w:tentative="1">
+      <w:start w:val="1"/>
+      <w:numFmt w:val="bullet"/>
+      <w:lvlText w:val=""/>
+      <w:lvlJc w:val="left"/>
+      <w:pPr>
+        <w:ind w:left="4320" w:hanging="360"/>
+      </w:pPr>
+      <w:rPr>
+        <w:rFonts w:ascii="Wingdings" w:hAnsi="Wingdings" w:hint="default"/>
+      </w:rPr>
+    </w:lvl>
+    <w:lvl w:ilvl="6" w:tplc="0C0A0001" w:tentative="1">
+      <w:start w:val="1"/>
+      <w:numFmt w:val="bullet"/>
+      <w:lvlText w:val=""/>
+      <w:lvlJc w:val="left"/>
+      <w:pPr>
+        <w:ind w:left="5040" w:hanging="360"/>
+      </w:pPr>
+      <w:rPr>
+        <w:rFonts w:ascii="Symbol" w:hAnsi="Symbol" w:hint="default"/>
+      </w:rPr>
+    </w:lvl>
+    <w:lvl w:ilvl="7" w:tplc="0C0A0003" w:tentative="1">
+      <w:start w:val="1"/>
+      <w:numFmt w:val="bullet"/>
+      <w:lvlText w:val="o"/>
+      <w:lvlJc w:val="left"/>
+      <w:pPr>
+        <w:ind w:left="5760" w:hanging="360"/>
+      </w:pPr>
+      <w:rPr>
+        <w:rFonts w:ascii="Courier New" w:hAnsi="Courier New" w:cs="Courier New" w:hint="default"/>
+      </w:rPr>
+    </w:lvl>
+    <w:lvl w:ilvl="8" w:tplc="0C0A0005" w:tentative="1">
+      <w:start w:val="1"/>
+      <w:numFmt w:val="bullet"/>
+      <w:lvlText w:val=""/>
+      <w:lvlJc w:val="left"/>
+      <w:pPr>
+        <w:ind w:left="6480" w:hanging="360"/>
+      </w:pPr>
+      <w:rPr>
+        <w:rFonts w:ascii="Wingdings" w:hAnsi="Wingdings" w:hint="default"/>
+      </w:rPr>
+    </w:lvl>
+  </w:abstractNum>
+  <w:abstractNum w:abstractNumId="6" w15:restartNumberingAfterBreak="0">
     <w:nsid w:val="73B82288"/>
     <w:multiLevelType w:val="hybridMultilevel"/>
     <w:tmpl w:val="8D1CDDF0"/>
@@ -5822,16 +9648,22 @@
     <w:abstractNumId w:val="0"/>
   </w:num>
   <w:num w:numId="3" w16cid:durableId="922184172">
-    <w:abstractNumId w:val="1"/>
+    <w:abstractNumId w:val="2"/>
   </w:num>
   <w:num w:numId="4" w16cid:durableId="1665090835">
-    <w:abstractNumId w:val="2"/>
+    <w:abstractNumId w:val="3"/>
   </w:num>
   <w:num w:numId="5" w16cid:durableId="1436945978">
-    <w:abstractNumId w:val="3"/>
+    <w:abstractNumId w:val="5"/>
   </w:num>
   <w:num w:numId="6" w16cid:durableId="1891381337">
+    <w:abstractNumId w:val="6"/>
+  </w:num>
+  <w:num w:numId="7" w16cid:durableId="1912229945">
     <w:abstractNumId w:val="4"/>
+  </w:num>
+  <w:num w:numId="8" w16cid:durableId="538202684">
+    <w:abstractNumId w:val="1"/>
   </w:num>
 </w:numbering>
 </file>

</xml_diff>